<commit_message>
second version - english
</commit_message>
<xml_diff>
--- a/cv.docx
+++ b/cv.docx
@@ -21,8 +21,21 @@
           <w:szCs w:val="28"/>
           <w:lang w:val="en-US"/>
         </w:rPr>
-        <w:t>Ioana-Lavinia Pârvulescu</w:t>
-      </w:r>
+        <w:t xml:space="preserve">Ioana-Lavinia </w:t>
+      </w:r>
+      <w:proofErr w:type="spellStart"/>
+      <w:r>
+        <w:rPr>
+          <w:rStyle w:val="TitluCaracter"/>
+          <w:b/>
+          <w:bCs/>
+          <w:sz w:val="28"/>
+          <w:szCs w:val="28"/>
+          <w:lang w:val="en-US"/>
+        </w:rPr>
+        <w:t>Pârvulescu</w:t>
+      </w:r>
+      <w:proofErr w:type="spellEnd"/>
       <w:r>
         <w:rPr>
           <w:rStyle w:val="TitluCaracter"/>
@@ -194,13 +207,383 @@
           <w:szCs w:val="20"/>
         </w:rPr>
       </w:pPr>
-      <w:r>
-        <w:rPr>
-          <w:rFonts w:ascii="Helvetica" w:hAnsi="Helvetica"/>
-          <w:sz w:val="20"/>
-          <w:szCs w:val="20"/>
-        </w:rPr>
-        <w:t>Systems Engineering undergraduate experienced in algorithmic design, object-oriented software development, and embedded control systems. Focused on building scalable logic, ensuring system reliability, and delivering seamless integration between software and hardware environments.</w:t>
+      <w:proofErr w:type="spellStart"/>
+      <w:r>
+        <w:rPr>
+          <w:rFonts w:ascii="Helvetica" w:hAnsi="Helvetica"/>
+          <w:sz w:val="20"/>
+          <w:szCs w:val="20"/>
+        </w:rPr>
+        <w:t>Systems</w:t>
+      </w:r>
+      <w:proofErr w:type="spellEnd"/>
+      <w:r>
+        <w:rPr>
+          <w:rFonts w:ascii="Helvetica" w:hAnsi="Helvetica"/>
+          <w:sz w:val="20"/>
+          <w:szCs w:val="20"/>
+        </w:rPr>
+        <w:t xml:space="preserve"> Engineering </w:t>
+      </w:r>
+      <w:proofErr w:type="spellStart"/>
+      <w:r>
+        <w:rPr>
+          <w:rFonts w:ascii="Helvetica" w:hAnsi="Helvetica"/>
+          <w:sz w:val="20"/>
+          <w:szCs w:val="20"/>
+        </w:rPr>
+        <w:t>undergraduate</w:t>
+      </w:r>
+      <w:proofErr w:type="spellEnd"/>
+      <w:r>
+        <w:rPr>
+          <w:rFonts w:ascii="Helvetica" w:hAnsi="Helvetica"/>
+          <w:sz w:val="20"/>
+          <w:szCs w:val="20"/>
+        </w:rPr>
+        <w:t xml:space="preserve"> </w:t>
+      </w:r>
+      <w:proofErr w:type="spellStart"/>
+      <w:r>
+        <w:rPr>
+          <w:rFonts w:ascii="Helvetica" w:hAnsi="Helvetica"/>
+          <w:sz w:val="20"/>
+          <w:szCs w:val="20"/>
+        </w:rPr>
+        <w:t>experienced</w:t>
+      </w:r>
+      <w:proofErr w:type="spellEnd"/>
+      <w:r>
+        <w:rPr>
+          <w:rFonts w:ascii="Helvetica" w:hAnsi="Helvetica"/>
+          <w:sz w:val="20"/>
+          <w:szCs w:val="20"/>
+        </w:rPr>
+        <w:t xml:space="preserve"> in </w:t>
+      </w:r>
+      <w:proofErr w:type="spellStart"/>
+      <w:r>
+        <w:rPr>
+          <w:rFonts w:ascii="Helvetica" w:hAnsi="Helvetica"/>
+          <w:sz w:val="20"/>
+          <w:szCs w:val="20"/>
+        </w:rPr>
+        <w:t>algorithmic</w:t>
+      </w:r>
+      <w:proofErr w:type="spellEnd"/>
+      <w:r>
+        <w:rPr>
+          <w:rFonts w:ascii="Helvetica" w:hAnsi="Helvetica"/>
+          <w:sz w:val="20"/>
+          <w:szCs w:val="20"/>
+        </w:rPr>
+        <w:t xml:space="preserve"> design, </w:t>
+      </w:r>
+      <w:proofErr w:type="spellStart"/>
+      <w:r>
+        <w:rPr>
+          <w:rFonts w:ascii="Helvetica" w:hAnsi="Helvetica"/>
+          <w:sz w:val="20"/>
+          <w:szCs w:val="20"/>
+        </w:rPr>
+        <w:t>object-oriented</w:t>
+      </w:r>
+      <w:proofErr w:type="spellEnd"/>
+      <w:r>
+        <w:rPr>
+          <w:rFonts w:ascii="Helvetica" w:hAnsi="Helvetica"/>
+          <w:sz w:val="20"/>
+          <w:szCs w:val="20"/>
+        </w:rPr>
+        <w:t xml:space="preserve"> software </w:t>
+      </w:r>
+      <w:proofErr w:type="spellStart"/>
+      <w:r>
+        <w:rPr>
+          <w:rFonts w:ascii="Helvetica" w:hAnsi="Helvetica"/>
+          <w:sz w:val="20"/>
+          <w:szCs w:val="20"/>
+        </w:rPr>
+        <w:t>development</w:t>
+      </w:r>
+      <w:proofErr w:type="spellEnd"/>
+      <w:r>
+        <w:rPr>
+          <w:rFonts w:ascii="Helvetica" w:hAnsi="Helvetica"/>
+          <w:sz w:val="20"/>
+          <w:szCs w:val="20"/>
+        </w:rPr>
+        <w:t xml:space="preserve">, </w:t>
+      </w:r>
+      <w:proofErr w:type="spellStart"/>
+      <w:r>
+        <w:rPr>
+          <w:rFonts w:ascii="Helvetica" w:hAnsi="Helvetica"/>
+          <w:sz w:val="20"/>
+          <w:szCs w:val="20"/>
+        </w:rPr>
+        <w:t>and</w:t>
+      </w:r>
+      <w:proofErr w:type="spellEnd"/>
+      <w:r>
+        <w:rPr>
+          <w:rFonts w:ascii="Helvetica" w:hAnsi="Helvetica"/>
+          <w:sz w:val="20"/>
+          <w:szCs w:val="20"/>
+        </w:rPr>
+        <w:t xml:space="preserve"> </w:t>
+      </w:r>
+      <w:proofErr w:type="spellStart"/>
+      <w:r>
+        <w:rPr>
+          <w:rFonts w:ascii="Helvetica" w:hAnsi="Helvetica"/>
+          <w:sz w:val="20"/>
+          <w:szCs w:val="20"/>
+        </w:rPr>
+        <w:t>embedded</w:t>
+      </w:r>
+      <w:proofErr w:type="spellEnd"/>
+      <w:r>
+        <w:rPr>
+          <w:rFonts w:ascii="Helvetica" w:hAnsi="Helvetica"/>
+          <w:sz w:val="20"/>
+          <w:szCs w:val="20"/>
+        </w:rPr>
+        <w:t xml:space="preserve"> control </w:t>
+      </w:r>
+      <w:proofErr w:type="spellStart"/>
+      <w:r>
+        <w:rPr>
+          <w:rFonts w:ascii="Helvetica" w:hAnsi="Helvetica"/>
+          <w:sz w:val="20"/>
+          <w:szCs w:val="20"/>
+        </w:rPr>
+        <w:t>systems</w:t>
+      </w:r>
+      <w:proofErr w:type="spellEnd"/>
+      <w:r>
+        <w:rPr>
+          <w:rFonts w:ascii="Helvetica" w:hAnsi="Helvetica"/>
+          <w:sz w:val="20"/>
+          <w:szCs w:val="20"/>
+        </w:rPr>
+        <w:t xml:space="preserve">. </w:t>
+      </w:r>
+      <w:proofErr w:type="spellStart"/>
+      <w:r>
+        <w:rPr>
+          <w:rFonts w:ascii="Helvetica" w:hAnsi="Helvetica"/>
+          <w:sz w:val="20"/>
+          <w:szCs w:val="20"/>
+        </w:rPr>
+        <w:t>Focused</w:t>
+      </w:r>
+      <w:proofErr w:type="spellEnd"/>
+      <w:r>
+        <w:rPr>
+          <w:rFonts w:ascii="Helvetica" w:hAnsi="Helvetica"/>
+          <w:sz w:val="20"/>
+          <w:szCs w:val="20"/>
+        </w:rPr>
+        <w:t xml:space="preserve"> on building </w:t>
+      </w:r>
+      <w:proofErr w:type="spellStart"/>
+      <w:r>
+        <w:rPr>
+          <w:rFonts w:ascii="Helvetica" w:hAnsi="Helvetica"/>
+          <w:sz w:val="20"/>
+          <w:szCs w:val="20"/>
+        </w:rPr>
+        <w:t>scalable</w:t>
+      </w:r>
+      <w:proofErr w:type="spellEnd"/>
+      <w:r>
+        <w:rPr>
+          <w:rFonts w:ascii="Helvetica" w:hAnsi="Helvetica"/>
+          <w:sz w:val="20"/>
+          <w:szCs w:val="20"/>
+        </w:rPr>
+        <w:t xml:space="preserve"> logic, </w:t>
+      </w:r>
+      <w:proofErr w:type="spellStart"/>
+      <w:r>
+        <w:rPr>
+          <w:rFonts w:ascii="Helvetica" w:hAnsi="Helvetica"/>
+          <w:sz w:val="20"/>
+          <w:szCs w:val="20"/>
+        </w:rPr>
+        <w:t>ensuring</w:t>
+      </w:r>
+      <w:proofErr w:type="spellEnd"/>
+      <w:r>
+        <w:rPr>
+          <w:rFonts w:ascii="Helvetica" w:hAnsi="Helvetica"/>
+          <w:sz w:val="20"/>
+          <w:szCs w:val="20"/>
+        </w:rPr>
+        <w:t xml:space="preserve"> </w:t>
+      </w:r>
+      <w:proofErr w:type="spellStart"/>
+      <w:r>
+        <w:rPr>
+          <w:rFonts w:ascii="Helvetica" w:hAnsi="Helvetica"/>
+          <w:sz w:val="20"/>
+          <w:szCs w:val="20"/>
+        </w:rPr>
+        <w:t>system</w:t>
+      </w:r>
+      <w:proofErr w:type="spellEnd"/>
+      <w:r>
+        <w:rPr>
+          <w:rFonts w:ascii="Helvetica" w:hAnsi="Helvetica"/>
+          <w:sz w:val="20"/>
+          <w:szCs w:val="20"/>
+        </w:rPr>
+        <w:t xml:space="preserve"> </w:t>
+      </w:r>
+      <w:proofErr w:type="spellStart"/>
+      <w:r>
+        <w:rPr>
+          <w:rFonts w:ascii="Helvetica" w:hAnsi="Helvetica"/>
+          <w:sz w:val="20"/>
+          <w:szCs w:val="20"/>
+        </w:rPr>
+        <w:t>reliability</w:t>
+      </w:r>
+      <w:proofErr w:type="spellEnd"/>
+      <w:r>
+        <w:rPr>
+          <w:rFonts w:ascii="Helvetica" w:hAnsi="Helvetica"/>
+          <w:sz w:val="20"/>
+          <w:szCs w:val="20"/>
+        </w:rPr>
+        <w:t xml:space="preserve">, </w:t>
+      </w:r>
+      <w:proofErr w:type="spellStart"/>
+      <w:r>
+        <w:rPr>
+          <w:rFonts w:ascii="Helvetica" w:hAnsi="Helvetica"/>
+          <w:sz w:val="20"/>
+          <w:szCs w:val="20"/>
+        </w:rPr>
+        <w:t>and</w:t>
+      </w:r>
+      <w:proofErr w:type="spellEnd"/>
+      <w:r>
+        <w:rPr>
+          <w:rFonts w:ascii="Helvetica" w:hAnsi="Helvetica"/>
+          <w:sz w:val="20"/>
+          <w:szCs w:val="20"/>
+        </w:rPr>
+        <w:t xml:space="preserve"> </w:t>
+      </w:r>
+      <w:proofErr w:type="spellStart"/>
+      <w:r>
+        <w:rPr>
+          <w:rFonts w:ascii="Helvetica" w:hAnsi="Helvetica"/>
+          <w:sz w:val="20"/>
+          <w:szCs w:val="20"/>
+        </w:rPr>
+        <w:t>delivering</w:t>
+      </w:r>
+      <w:proofErr w:type="spellEnd"/>
+      <w:r>
+        <w:rPr>
+          <w:rFonts w:ascii="Helvetica" w:hAnsi="Helvetica"/>
+          <w:sz w:val="20"/>
+          <w:szCs w:val="20"/>
+        </w:rPr>
+        <w:t xml:space="preserve"> </w:t>
+      </w:r>
+      <w:proofErr w:type="spellStart"/>
+      <w:r>
+        <w:rPr>
+          <w:rFonts w:ascii="Helvetica" w:hAnsi="Helvetica"/>
+          <w:sz w:val="20"/>
+          <w:szCs w:val="20"/>
+        </w:rPr>
+        <w:t>seamless</w:t>
+      </w:r>
+      <w:proofErr w:type="spellEnd"/>
+      <w:r>
+        <w:rPr>
+          <w:rFonts w:ascii="Helvetica" w:hAnsi="Helvetica"/>
+          <w:sz w:val="20"/>
+          <w:szCs w:val="20"/>
+        </w:rPr>
+        <w:t xml:space="preserve"> </w:t>
+      </w:r>
+      <w:proofErr w:type="spellStart"/>
+      <w:r>
+        <w:rPr>
+          <w:rFonts w:ascii="Helvetica" w:hAnsi="Helvetica"/>
+          <w:sz w:val="20"/>
+          <w:szCs w:val="20"/>
+        </w:rPr>
+        <w:t>integration</w:t>
+      </w:r>
+      <w:proofErr w:type="spellEnd"/>
+      <w:r>
+        <w:rPr>
+          <w:rFonts w:ascii="Helvetica" w:hAnsi="Helvetica"/>
+          <w:sz w:val="20"/>
+          <w:szCs w:val="20"/>
+        </w:rPr>
+        <w:t xml:space="preserve"> </w:t>
+      </w:r>
+      <w:proofErr w:type="spellStart"/>
+      <w:r>
+        <w:rPr>
+          <w:rFonts w:ascii="Helvetica" w:hAnsi="Helvetica"/>
+          <w:sz w:val="20"/>
+          <w:szCs w:val="20"/>
+        </w:rPr>
+        <w:t>between</w:t>
+      </w:r>
+      <w:proofErr w:type="spellEnd"/>
+      <w:r>
+        <w:rPr>
+          <w:rFonts w:ascii="Helvetica" w:hAnsi="Helvetica"/>
+          <w:sz w:val="20"/>
+          <w:szCs w:val="20"/>
+        </w:rPr>
+        <w:t xml:space="preserve"> software </w:t>
+      </w:r>
+      <w:proofErr w:type="spellStart"/>
+      <w:r>
+        <w:rPr>
+          <w:rFonts w:ascii="Helvetica" w:hAnsi="Helvetica"/>
+          <w:sz w:val="20"/>
+          <w:szCs w:val="20"/>
+        </w:rPr>
+        <w:t>and</w:t>
+      </w:r>
+      <w:proofErr w:type="spellEnd"/>
+      <w:r>
+        <w:rPr>
+          <w:rFonts w:ascii="Helvetica" w:hAnsi="Helvetica"/>
+          <w:sz w:val="20"/>
+          <w:szCs w:val="20"/>
+        </w:rPr>
+        <w:t xml:space="preserve"> hardware </w:t>
+      </w:r>
+      <w:proofErr w:type="spellStart"/>
+      <w:r>
+        <w:rPr>
+          <w:rFonts w:ascii="Helvetica" w:hAnsi="Helvetica"/>
+          <w:sz w:val="20"/>
+          <w:szCs w:val="20"/>
+        </w:rPr>
+        <w:t>environments</w:t>
+      </w:r>
+      <w:proofErr w:type="spellEnd"/>
+      <w:r>
+        <w:rPr>
+          <w:rFonts w:ascii="Helvetica" w:hAnsi="Helvetica"/>
+          <w:sz w:val="20"/>
+          <w:szCs w:val="20"/>
+        </w:rPr>
+        <w:t>.</w:t>
       </w:r>
     </w:p>
     <w:p>
@@ -218,20 +601,22 @@
         <w:spacing w:after="0"/>
         <w:rPr>
           <w:rFonts w:ascii="Helvetica" w:hAnsi="Helvetica"/>
-          <w:sz w:val="20"/>
-          <w:szCs w:val="20"/>
-          <w:lang w:val="en-US"/>
-        </w:rPr>
-      </w:pPr>
-      <w:r>
-        <w:rPr>
-          <w:rFonts w:ascii="Helvetica" w:hAnsi="Helvetica"/>
           <w:b/>
           <w:bCs/>
           <w:sz w:val="20"/>
           <w:szCs w:val="20"/>
           <w:lang w:val="en-US"/>
         </w:rPr>
+      </w:pPr>
+      <w:r>
+        <w:rPr>
+          <w:rFonts w:ascii="Helvetica" w:hAnsi="Helvetica"/>
+          <w:b/>
+          <w:bCs/>
+          <w:sz w:val="20"/>
+          <w:szCs w:val="20"/>
+          <w:lang w:val="en-US"/>
+        </w:rPr>
         <w:t>TECHNICAL SKILLS</w:t>
       </w:r>
     </w:p>
@@ -239,144 +624,138 @@
       <w:pPr>
         <w:numPr>
           <w:ilvl w:val="0"/>
-          <w:numId w:val="1"/>
+          <w:numId w:val="15"/>
         </w:numPr>
         <w:spacing w:after="0"/>
         <w:rPr>
           <w:rFonts w:ascii="Helvetica" w:hAnsi="Helvetica"/>
-          <w:sz w:val="20"/>
-          <w:szCs w:val="20"/>
-          <w:lang w:val="en-US"/>
-        </w:rPr>
-      </w:pPr>
-      <w:r>
-        <w:rPr>
-          <w:rFonts w:ascii="Helvetica" w:hAnsi="Helvetica"/>
           <w:b/>
           <w:bCs/>
           <w:sz w:val="20"/>
           <w:szCs w:val="20"/>
           <w:lang w:val="en-US"/>
         </w:rPr>
-        <w:t>Programming Languages:</w:t>
-      </w:r>
-      <w:r>
-        <w:rPr>
-          <w:rFonts w:ascii="Helvetica" w:hAnsi="Helvetica"/>
-          <w:sz w:val="20"/>
-          <w:szCs w:val="20"/>
-          <w:lang w:val="en-US"/>
-        </w:rPr>
-        <w:t xml:space="preserve"> C</w:t>
-      </w:r>
-      <w:r>
-        <w:rPr>
-          <w:rFonts w:ascii="Helvetica" w:hAnsi="Helvetica"/>
-          <w:sz w:val="20"/>
-          <w:szCs w:val="20"/>
-          <w:lang w:val="en-US"/>
-        </w:rPr>
-        <w:t xml:space="preserve">, </w:t>
-      </w:r>
-      <w:r>
-        <w:rPr>
-          <w:rFonts w:ascii="Helvetica" w:hAnsi="Helvetica"/>
-          <w:sz w:val="20"/>
-          <w:szCs w:val="20"/>
-          <w:lang w:val="en-US"/>
-        </w:rPr>
-        <w:t>C++, Java, MATLAB, Julia, HTML</w:t>
-      </w:r>
-      <w:r>
-        <w:rPr>
-          <w:rFonts w:ascii="Helvetica" w:hAnsi="Helvetica"/>
-          <w:sz w:val="20"/>
-          <w:szCs w:val="20"/>
-          <w:lang w:val="en-US"/>
-        </w:rPr>
-        <w:t>/</w:t>
-      </w:r>
-      <w:r>
-        <w:rPr>
-          <w:rFonts w:ascii="Helvetica" w:hAnsi="Helvetica"/>
-          <w:sz w:val="20"/>
-          <w:szCs w:val="20"/>
-          <w:lang w:val="en-US"/>
-        </w:rPr>
-        <w:t>CSS/JavaScript, CLINGO.</w:t>
+      </w:pPr>
+      <w:r>
+        <w:rPr>
+          <w:rFonts w:ascii="Helvetica" w:hAnsi="Helvetica"/>
+          <w:b/>
+          <w:bCs/>
+          <w:sz w:val="20"/>
+          <w:szCs w:val="20"/>
+          <w:lang w:val="en-US"/>
+        </w:rPr>
+        <w:t xml:space="preserve">Languages: </w:t>
+      </w:r>
+      <w:r>
+        <w:rPr>
+          <w:rFonts w:ascii="Helvetica" w:hAnsi="Helvetica"/>
+          <w:sz w:val="20"/>
+          <w:szCs w:val="20"/>
+          <w:lang w:val="en-US"/>
+        </w:rPr>
+        <w:t>C, C++, Java, MATLAB, Julia, CLINGO</w:t>
       </w:r>
     </w:p>
     <w:p>
       <w:pPr>
         <w:numPr>
           <w:ilvl w:val="0"/>
-          <w:numId w:val="1"/>
+          <w:numId w:val="15"/>
         </w:numPr>
         <w:spacing w:after="0"/>
         <w:rPr>
           <w:rFonts w:ascii="Helvetica" w:hAnsi="Helvetica"/>
-          <w:sz w:val="20"/>
-          <w:szCs w:val="20"/>
-          <w:lang w:val="en-US"/>
-        </w:rPr>
-      </w:pPr>
-      <w:r>
-        <w:rPr>
-          <w:rFonts w:ascii="Helvetica" w:hAnsi="Helvetica"/>
           <w:b/>
           <w:bCs/>
           <w:sz w:val="20"/>
           <w:szCs w:val="20"/>
-        </w:rPr>
-        <w:t>Hardware &amp; Embedded:</w:t>
-      </w:r>
-      <w:r>
-        <w:rPr>
-          <w:rFonts w:ascii="Helvetica" w:hAnsi="Helvetica"/>
-          <w:sz w:val="20"/>
-          <w:szCs w:val="20"/>
-        </w:rPr>
-        <w:t xml:space="preserve"> Microcontroller Programming (Arduino Uno R3, Cypress PSoC), Master-Slave Architectures, Analog &amp; Digital Electronics, Hardware Communication Protocols (SPI, I2C, Bluetooth), Sensor &amp; Actuator Integration (MQ-7, PIR, DHT11, Moisture, Servos, H-Bridge / DC Motors).</w:t>
+          <w:lang w:val="en-US"/>
+        </w:rPr>
+      </w:pPr>
+      <w:r>
+        <w:rPr>
+          <w:rFonts w:ascii="Helvetica" w:hAnsi="Helvetica"/>
+          <w:b/>
+          <w:bCs/>
+          <w:sz w:val="20"/>
+          <w:szCs w:val="20"/>
+          <w:lang w:val="en-US"/>
+        </w:rPr>
+        <w:t xml:space="preserve">Embedded &amp; Hardware: </w:t>
+      </w:r>
+      <w:r>
+        <w:rPr>
+          <w:rFonts w:ascii="Helvetica" w:hAnsi="Helvetica"/>
+          <w:sz w:val="20"/>
+          <w:szCs w:val="20"/>
+          <w:lang w:val="en-US"/>
+        </w:rPr>
+        <w:t xml:space="preserve">Arduino, Cypress </w:t>
+      </w:r>
+      <w:proofErr w:type="spellStart"/>
+      <w:r>
+        <w:rPr>
+          <w:rFonts w:ascii="Helvetica" w:hAnsi="Helvetica"/>
+          <w:sz w:val="20"/>
+          <w:szCs w:val="20"/>
+          <w:lang w:val="en-US"/>
+        </w:rPr>
+        <w:t>PSoC</w:t>
+      </w:r>
+      <w:proofErr w:type="spellEnd"/>
+      <w:r>
+        <w:rPr>
+          <w:rFonts w:ascii="Helvetica" w:hAnsi="Helvetica"/>
+          <w:sz w:val="20"/>
+          <w:szCs w:val="20"/>
+          <w:lang w:val="en-US"/>
+        </w:rPr>
+        <w:t>, Sensors &amp; Actuators</w:t>
       </w:r>
     </w:p>
     <w:p>
       <w:pPr>
         <w:numPr>
           <w:ilvl w:val="0"/>
-          <w:numId w:val="1"/>
+          <w:numId w:val="15"/>
         </w:numPr>
         <w:spacing w:after="0"/>
         <w:rPr>
           <w:rFonts w:ascii="Helvetica" w:hAnsi="Helvetica"/>
-          <w:sz w:val="20"/>
-          <w:szCs w:val="20"/>
-          <w:lang w:val="en-US"/>
-        </w:rPr>
-      </w:pPr>
-      <w:r>
-        <w:rPr>
-          <w:rFonts w:ascii="Helvetica" w:hAnsi="Helvetica"/>
           <w:b/>
           <w:bCs/>
           <w:sz w:val="20"/>
           <w:szCs w:val="20"/>
-        </w:rPr>
-        <w:t>Systems &amp; Automation:</w:t>
-      </w:r>
-      <w:r>
-        <w:rPr>
-          <w:rFonts w:ascii="Helvetica" w:hAnsi="Helvetica"/>
-          <w:sz w:val="20"/>
-          <w:szCs w:val="20"/>
-        </w:rPr>
-        <w:t xml:space="preserve"> Control Theory &amp; Design (PID, Bode/Nyquist, Routh-Hurwitz), State-Space Modeling, System Identification, Signals &amp; Systems (DSP, FFT, Laplace/Z-Transforms), MATLAB/Simulink Modeling.</w:t>
+          <w:lang w:val="en-US"/>
+        </w:rPr>
+      </w:pPr>
+      <w:r>
+        <w:rPr>
+          <w:rFonts w:ascii="Helvetica" w:hAnsi="Helvetica"/>
+          <w:b/>
+          <w:bCs/>
+          <w:sz w:val="20"/>
+          <w:szCs w:val="20"/>
+          <w:lang w:val="en-US"/>
+        </w:rPr>
+        <w:t xml:space="preserve">Systems &amp; Automation: </w:t>
+      </w:r>
+      <w:r>
+        <w:rPr>
+          <w:rFonts w:ascii="Helvetica" w:hAnsi="Helvetica"/>
+          <w:sz w:val="20"/>
+          <w:szCs w:val="20"/>
+          <w:lang w:val="en-US"/>
+        </w:rPr>
+        <w:t>Control Theory (PID, Bode/Nyquist)</w:t>
       </w:r>
     </w:p>
     <w:p>
       <w:pPr>
         <w:numPr>
           <w:ilvl w:val="0"/>
-          <w:numId w:val="1"/>
+          <w:numId w:val="15"/>
         </w:numPr>
         <w:spacing w:after="0"/>
         <w:rPr>
@@ -393,57 +772,95 @@
           <w:bCs/>
           <w:sz w:val="20"/>
           <w:szCs w:val="20"/>
-        </w:rPr>
-        <w:t>Algorithms &amp; Software Design:</w:t>
-      </w:r>
-      <w:r>
-        <w:rPr>
-          <w:rFonts w:ascii="Helvetica" w:hAnsi="Helvetica"/>
-          <w:sz w:val="20"/>
-          <w:szCs w:val="20"/>
-        </w:rPr>
-        <w:t xml:space="preserve"> OOP, Data Structures (Trees: AVL/BST, Hash Tables, Heaps), Graph Algorithms (DFS/BFS), Algorithmic Paradigms (Dynamic Programming, Two Pointers), Multithreading, Non-blocking concepts.</w:t>
+          <w:lang w:val="en-US"/>
+        </w:rPr>
+        <w:t xml:space="preserve">Software &amp; Algorithms: </w:t>
+      </w:r>
+      <w:r>
+        <w:rPr>
+          <w:rFonts w:ascii="Helvetica" w:hAnsi="Helvetica"/>
+          <w:sz w:val="20"/>
+          <w:szCs w:val="20"/>
+          <w:lang w:val="en-US"/>
+        </w:rPr>
+        <w:t>OOP, Data Structures (Trees, Heaps, Hash Tables), Graph Algorithms (DFS/BFS), Dynamic Programming</w:t>
       </w:r>
     </w:p>
     <w:p>
       <w:pPr>
         <w:numPr>
           <w:ilvl w:val="0"/>
-          <w:numId w:val="1"/>
+          <w:numId w:val="15"/>
         </w:numPr>
         <w:spacing w:after="0"/>
         <w:rPr>
           <w:rFonts w:ascii="Helvetica" w:hAnsi="Helvetica"/>
-          <w:sz w:val="20"/>
-          <w:szCs w:val="20"/>
-          <w:lang w:val="en-US"/>
-        </w:rPr>
-      </w:pPr>
-      <w:r>
-        <w:rPr>
-          <w:rFonts w:ascii="Helvetica" w:hAnsi="Helvetica"/>
           <w:b/>
           <w:bCs/>
           <w:sz w:val="20"/>
           <w:szCs w:val="20"/>
-        </w:rPr>
-        <w:t>Tools &amp; Environment:</w:t>
-      </w:r>
-      <w:r>
-        <w:rPr>
-          <w:rFonts w:ascii="Helvetica" w:hAnsi="Helvetica"/>
-          <w:sz w:val="20"/>
-          <w:szCs w:val="20"/>
-        </w:rPr>
-        <w:t xml:space="preserve"> Git, GitHub, VS Code, Linux/Bash, Node.js (npm), Arduino IDE, PSoC Creator, MATLAB Control/Robust Toolboxes, AutoCAD, Netica.</w:t>
-      </w:r>
+          <w:lang w:val="en-US"/>
+        </w:rPr>
+      </w:pPr>
+      <w:r>
+        <w:rPr>
+          <w:rFonts w:ascii="Helvetica" w:hAnsi="Helvetica"/>
+          <w:b/>
+          <w:bCs/>
+          <w:sz w:val="20"/>
+          <w:szCs w:val="20"/>
+          <w:lang w:val="en-US"/>
+        </w:rPr>
+        <w:t xml:space="preserve">Tools &amp; Environment: </w:t>
+      </w:r>
+      <w:r>
+        <w:rPr>
+          <w:rFonts w:ascii="Helvetica" w:hAnsi="Helvetica"/>
+          <w:sz w:val="20"/>
+          <w:szCs w:val="20"/>
+          <w:lang w:val="en-US"/>
+        </w:rPr>
+        <w:t xml:space="preserve">Git, GitHub, Linux/Bash, Arduino IDE, </w:t>
+      </w:r>
+      <w:proofErr w:type="spellStart"/>
+      <w:r>
+        <w:rPr>
+          <w:rFonts w:ascii="Helvetica" w:hAnsi="Helvetica"/>
+          <w:sz w:val="20"/>
+          <w:szCs w:val="20"/>
+          <w:lang w:val="en-US"/>
+        </w:rPr>
+        <w:t>PSoC</w:t>
+      </w:r>
+      <w:proofErr w:type="spellEnd"/>
+      <w:r>
+        <w:rPr>
+          <w:rFonts w:ascii="Helvetica" w:hAnsi="Helvetica"/>
+          <w:sz w:val="20"/>
+          <w:szCs w:val="20"/>
+          <w:lang w:val="en-US"/>
+        </w:rPr>
+        <w:t xml:space="preserve"> Creator, MATLAB, AutoCAD, </w:t>
+      </w:r>
+      <w:proofErr w:type="spellStart"/>
+      <w:r>
+        <w:rPr>
+          <w:rFonts w:ascii="Helvetica" w:hAnsi="Helvetica"/>
+          <w:sz w:val="20"/>
+          <w:szCs w:val="20"/>
+          <w:lang w:val="en-US"/>
+        </w:rPr>
+        <w:t>Netica</w:t>
+      </w:r>
+      <w:proofErr w:type="spellEnd"/>
     </w:p>
     <w:p>
       <w:pPr>
         <w:spacing w:after="0"/>
-        <w:ind w:left="720"/>
-        <w:rPr>
-          <w:rFonts w:ascii="Helvetica" w:hAnsi="Helvetica"/>
+        <w:rPr>
+          <w:rFonts w:ascii="Helvetica" w:hAnsi="Helvetica"/>
+          <w:b/>
+          <w:bCs/>
           <w:sz w:val="20"/>
           <w:szCs w:val="20"/>
           <w:lang w:val="en-US"/>
@@ -455,20 +872,22 @@
         <w:spacing w:after="0"/>
         <w:rPr>
           <w:rFonts w:ascii="Helvetica" w:hAnsi="Helvetica"/>
-          <w:sz w:val="20"/>
-          <w:szCs w:val="20"/>
-          <w:lang w:val="en-US"/>
-        </w:rPr>
-      </w:pPr>
-      <w:r>
-        <w:rPr>
-          <w:rFonts w:ascii="Helvetica" w:hAnsi="Helvetica"/>
           <w:b/>
           <w:bCs/>
           <w:sz w:val="20"/>
           <w:szCs w:val="20"/>
           <w:lang w:val="en-US"/>
         </w:rPr>
+      </w:pPr>
+      <w:r>
+        <w:rPr>
+          <w:rFonts w:ascii="Helvetica" w:hAnsi="Helvetica"/>
+          <w:b/>
+          <w:bCs/>
+          <w:sz w:val="20"/>
+          <w:szCs w:val="20"/>
+          <w:lang w:val="en-US"/>
+        </w:rPr>
         <w:t>ENGINEERING &amp; SOFTWARE PROJECTS</w:t>
       </w:r>
     </w:p>
@@ -493,7 +912,174 @@
           <w:szCs w:val="20"/>
           <w:lang w:val="en-US"/>
         </w:rPr>
-        <w:t xml:space="preserve">Automated Smart Home Safety &amp; Exhaust System | </w:t>
+        <w:t xml:space="preserve">Algorithmic Data Pipeline ("The Royal Hunt") </w:t>
+      </w:r>
+      <w:r>
+        <w:rPr>
+          <w:rFonts w:ascii="Helvetica" w:hAnsi="Helvetica"/>
+          <w:sz w:val="20"/>
+          <w:szCs w:val="20"/>
+          <w:lang w:val="en-US"/>
+        </w:rPr>
+        <w:t>|</w:t>
+      </w:r>
+      <w:r>
+        <w:rPr>
+          <w:rFonts w:ascii="Helvetica" w:hAnsi="Helvetica"/>
+          <w:b/>
+          <w:bCs/>
+          <w:sz w:val="20"/>
+          <w:szCs w:val="20"/>
+          <w:lang w:val="en-US"/>
+        </w:rPr>
+        <w:t xml:space="preserve"> </w:t>
+      </w:r>
+      <w:r>
+        <w:rPr>
+          <w:rFonts w:ascii="Helvetica" w:hAnsi="Helvetica"/>
+          <w:i/>
+          <w:iCs/>
+          <w:sz w:val="20"/>
+          <w:szCs w:val="20"/>
+          <w:lang w:val="en-US"/>
+        </w:rPr>
+        <w:t>C, Algorithms &amp; Data Structures</w:t>
+      </w:r>
+    </w:p>
+    <w:p>
+      <w:pPr>
+        <w:numPr>
+          <w:ilvl w:val="0"/>
+          <w:numId w:val="4"/>
+        </w:numPr>
+        <w:spacing w:after="0"/>
+        <w:rPr>
+          <w:rFonts w:ascii="Helvetica" w:hAnsi="Helvetica"/>
+          <w:sz w:val="20"/>
+          <w:szCs w:val="20"/>
+          <w:lang w:val="en-US"/>
+        </w:rPr>
+      </w:pPr>
+      <w:r>
+        <w:rPr>
+          <w:rFonts w:ascii="Helvetica" w:hAnsi="Helvetica"/>
+          <w:sz w:val="20"/>
+          <w:szCs w:val="20"/>
+          <w:lang w:val="en-US"/>
+        </w:rPr>
+        <w:t>Architected a multi-stage data processing pipeline in C, intelligently chaining Queues and Binary Search Trees (BST) to parse, filter, and sort raw data extracted from CSV files.</w:t>
+      </w:r>
+    </w:p>
+    <w:p>
+      <w:pPr>
+        <w:numPr>
+          <w:ilvl w:val="0"/>
+          <w:numId w:val="4"/>
+        </w:numPr>
+        <w:spacing w:after="0"/>
+        <w:rPr>
+          <w:rFonts w:ascii="Helvetica" w:hAnsi="Helvetica"/>
+          <w:sz w:val="20"/>
+          <w:szCs w:val="20"/>
+          <w:lang w:val="en-US"/>
+        </w:rPr>
+      </w:pPr>
+      <w:r>
+        <w:rPr>
+          <w:rFonts w:ascii="Helvetica" w:hAnsi="Helvetica"/>
+          <w:sz w:val="20"/>
+          <w:szCs w:val="20"/>
+          <w:lang w:val="en-US"/>
+        </w:rPr>
+        <w:t xml:space="preserve">Optimized data retrieval and dynamic ranking by implementing Hash Tables for </w:t>
+      </w:r>
+      <w:proofErr w:type="gramStart"/>
+      <w:r>
+        <w:rPr>
+          <w:rFonts w:ascii="Helvetica" w:hAnsi="Helvetica"/>
+          <w:sz w:val="20"/>
+          <w:szCs w:val="20"/>
+          <w:lang w:val="en-US"/>
+        </w:rPr>
+        <w:t>O(</w:t>
+      </w:r>
+      <w:proofErr w:type="gramEnd"/>
+      <w:r>
+        <w:rPr>
+          <w:rFonts w:ascii="Helvetica" w:hAnsi="Helvetica"/>
+          <w:sz w:val="20"/>
+          <w:szCs w:val="20"/>
+          <w:lang w:val="en-US"/>
+        </w:rPr>
+        <w:t>1) record lookups and Max Heaps to efficiently update attributes and extract top-performing entities.</w:t>
+      </w:r>
+    </w:p>
+    <w:p>
+      <w:pPr>
+        <w:numPr>
+          <w:ilvl w:val="0"/>
+          <w:numId w:val="4"/>
+        </w:numPr>
+        <w:spacing w:after="0"/>
+        <w:rPr>
+          <w:rFonts w:ascii="Helvetica" w:hAnsi="Helvetica"/>
+          <w:sz w:val="20"/>
+          <w:szCs w:val="20"/>
+          <w:lang w:val="en-US"/>
+        </w:rPr>
+      </w:pPr>
+      <w:r>
+        <w:rPr>
+          <w:rFonts w:ascii="Helvetica" w:hAnsi="Helvetica"/>
+          <w:sz w:val="20"/>
+          <w:szCs w:val="20"/>
+          <w:lang w:val="en-US"/>
+        </w:rPr>
+        <w:t>Implemented Depth-First Search (DFS) graph traversal algorithms to calculate and evaluate all valid network routes for automated entity assignment based on dynamic criteria.</w:t>
+      </w:r>
+    </w:p>
+    <w:p>
+      <w:pPr>
+        <w:spacing w:after="0"/>
+        <w:rPr>
+          <w:rFonts w:ascii="Helvetica" w:hAnsi="Helvetica"/>
+          <w:b/>
+          <w:bCs/>
+          <w:sz w:val="20"/>
+          <w:szCs w:val="20"/>
+          <w:lang w:val="en-US"/>
+        </w:rPr>
+      </w:pPr>
+      <w:r>
+        <w:rPr>
+          <w:rFonts w:ascii="Helvetica" w:hAnsi="Helvetica"/>
+          <w:b/>
+          <w:bCs/>
+          <w:sz w:val="20"/>
+          <w:szCs w:val="20"/>
+          <w:lang w:val="en-US"/>
+        </w:rPr>
+        <w:t xml:space="preserve">Automated Smart Home Safety &amp; Exhaust System </w:t>
+      </w:r>
+      <w:r>
+        <w:rPr>
+          <w:rFonts w:ascii="Helvetica" w:hAnsi="Helvetica"/>
+          <w:sz w:val="20"/>
+          <w:szCs w:val="20"/>
+          <w:lang w:val="en-US"/>
+        </w:rPr>
+        <w:t>|</w:t>
+      </w:r>
+      <w:r>
+        <w:rPr>
+          <w:rFonts w:ascii="Helvetica" w:hAnsi="Helvetica"/>
+          <w:b/>
+          <w:bCs/>
+          <w:sz w:val="20"/>
+          <w:szCs w:val="20"/>
+          <w:lang w:val="en-US"/>
+        </w:rPr>
+        <w:t xml:space="preserve"> </w:t>
       </w:r>
       <w:r>
         <w:rPr>
@@ -521,14 +1107,257 @@
           <w:lang w:val="en-US"/>
         </w:rPr>
       </w:pPr>
-      <w:r>
-        <w:rPr>
-          <w:rFonts w:ascii="Helvetica" w:hAnsi="Helvetica"/>
-          <w:sz w:val="20"/>
-          <w:szCs w:val="20"/>
-          <w:lang w:val="en-US"/>
-        </w:rPr>
-        <w:t>Engineered an automated safety system using an Arduino Uno to monitor hazardous gas levels (MQ-7) and automatically trigger a DC ventilation fan and a servo-driven window mechanism.</w:t>
+      <w:proofErr w:type="spellStart"/>
+      <w:r>
+        <w:rPr>
+          <w:rFonts w:ascii="Helvetica" w:hAnsi="Helvetica"/>
+          <w:sz w:val="20"/>
+          <w:szCs w:val="20"/>
+        </w:rPr>
+        <w:t>Engineered</w:t>
+      </w:r>
+      <w:proofErr w:type="spellEnd"/>
+      <w:r>
+        <w:rPr>
+          <w:rFonts w:ascii="Helvetica" w:hAnsi="Helvetica"/>
+          <w:sz w:val="20"/>
+          <w:szCs w:val="20"/>
+        </w:rPr>
+        <w:t xml:space="preserve"> an </w:t>
+      </w:r>
+      <w:proofErr w:type="spellStart"/>
+      <w:r>
+        <w:rPr>
+          <w:rFonts w:ascii="Helvetica" w:hAnsi="Helvetica"/>
+          <w:sz w:val="20"/>
+          <w:szCs w:val="20"/>
+        </w:rPr>
+        <w:t>automated</w:t>
+      </w:r>
+      <w:proofErr w:type="spellEnd"/>
+      <w:r>
+        <w:rPr>
+          <w:rFonts w:ascii="Helvetica" w:hAnsi="Helvetica"/>
+          <w:sz w:val="20"/>
+          <w:szCs w:val="20"/>
+        </w:rPr>
+        <w:t xml:space="preserve"> </w:t>
+      </w:r>
+      <w:proofErr w:type="spellStart"/>
+      <w:r>
+        <w:rPr>
+          <w:rFonts w:ascii="Helvetica" w:hAnsi="Helvetica"/>
+          <w:sz w:val="20"/>
+          <w:szCs w:val="20"/>
+        </w:rPr>
+        <w:t>safety</w:t>
+      </w:r>
+      <w:proofErr w:type="spellEnd"/>
+      <w:r>
+        <w:rPr>
+          <w:rFonts w:ascii="Helvetica" w:hAnsi="Helvetica"/>
+          <w:sz w:val="20"/>
+          <w:szCs w:val="20"/>
+        </w:rPr>
+        <w:t xml:space="preserve"> </w:t>
+      </w:r>
+      <w:proofErr w:type="spellStart"/>
+      <w:r>
+        <w:rPr>
+          <w:rFonts w:ascii="Helvetica" w:hAnsi="Helvetica"/>
+          <w:sz w:val="20"/>
+          <w:szCs w:val="20"/>
+        </w:rPr>
+        <w:t>system</w:t>
+      </w:r>
+      <w:proofErr w:type="spellEnd"/>
+      <w:r>
+        <w:rPr>
+          <w:rFonts w:ascii="Helvetica" w:hAnsi="Helvetica"/>
+          <w:sz w:val="20"/>
+          <w:szCs w:val="20"/>
+        </w:rPr>
+        <w:t xml:space="preserve"> </w:t>
+      </w:r>
+      <w:proofErr w:type="spellStart"/>
+      <w:r>
+        <w:rPr>
+          <w:rFonts w:ascii="Helvetica" w:hAnsi="Helvetica"/>
+          <w:sz w:val="20"/>
+          <w:szCs w:val="20"/>
+        </w:rPr>
+        <w:t>using</w:t>
+      </w:r>
+      <w:proofErr w:type="spellEnd"/>
+      <w:r>
+        <w:rPr>
+          <w:rFonts w:ascii="Helvetica" w:hAnsi="Helvetica"/>
+          <w:sz w:val="20"/>
+          <w:szCs w:val="20"/>
+        </w:rPr>
+        <w:t xml:space="preserve"> an </w:t>
+      </w:r>
+      <w:proofErr w:type="spellStart"/>
+      <w:r>
+        <w:rPr>
+          <w:rFonts w:ascii="Helvetica" w:hAnsi="Helvetica"/>
+          <w:sz w:val="20"/>
+          <w:szCs w:val="20"/>
+        </w:rPr>
+        <w:t>Arduino</w:t>
+      </w:r>
+      <w:proofErr w:type="spellEnd"/>
+      <w:r>
+        <w:rPr>
+          <w:rFonts w:ascii="Helvetica" w:hAnsi="Helvetica"/>
+          <w:sz w:val="20"/>
+          <w:szCs w:val="20"/>
+        </w:rPr>
+        <w:t xml:space="preserve"> </w:t>
+      </w:r>
+      <w:proofErr w:type="spellStart"/>
+      <w:r>
+        <w:rPr>
+          <w:rFonts w:ascii="Helvetica" w:hAnsi="Helvetica"/>
+          <w:sz w:val="20"/>
+          <w:szCs w:val="20"/>
+        </w:rPr>
+        <w:t>Uno</w:t>
+      </w:r>
+      <w:proofErr w:type="spellEnd"/>
+      <w:r>
+        <w:rPr>
+          <w:rFonts w:ascii="Helvetica" w:hAnsi="Helvetica"/>
+          <w:sz w:val="20"/>
+          <w:szCs w:val="20"/>
+        </w:rPr>
+        <w:t xml:space="preserve"> </w:t>
+      </w:r>
+      <w:proofErr w:type="spellStart"/>
+      <w:r>
+        <w:rPr>
+          <w:rFonts w:ascii="Helvetica" w:hAnsi="Helvetica"/>
+          <w:sz w:val="20"/>
+          <w:szCs w:val="20"/>
+        </w:rPr>
+        <w:t>to</w:t>
+      </w:r>
+      <w:proofErr w:type="spellEnd"/>
+      <w:r>
+        <w:rPr>
+          <w:rFonts w:ascii="Helvetica" w:hAnsi="Helvetica"/>
+          <w:sz w:val="20"/>
+          <w:szCs w:val="20"/>
+        </w:rPr>
+        <w:t xml:space="preserve"> monitor </w:t>
+      </w:r>
+      <w:proofErr w:type="spellStart"/>
+      <w:r>
+        <w:rPr>
+          <w:rFonts w:ascii="Helvetica" w:hAnsi="Helvetica"/>
+          <w:sz w:val="20"/>
+          <w:szCs w:val="20"/>
+        </w:rPr>
+        <w:t>hazardous</w:t>
+      </w:r>
+      <w:proofErr w:type="spellEnd"/>
+      <w:r>
+        <w:rPr>
+          <w:rFonts w:ascii="Helvetica" w:hAnsi="Helvetica"/>
+          <w:sz w:val="20"/>
+          <w:szCs w:val="20"/>
+        </w:rPr>
+        <w:t xml:space="preserve"> gas </w:t>
+      </w:r>
+      <w:proofErr w:type="spellStart"/>
+      <w:r>
+        <w:rPr>
+          <w:rFonts w:ascii="Helvetica" w:hAnsi="Helvetica"/>
+          <w:sz w:val="20"/>
+          <w:szCs w:val="20"/>
+        </w:rPr>
+        <w:t>levels</w:t>
+      </w:r>
+      <w:proofErr w:type="spellEnd"/>
+      <w:r>
+        <w:rPr>
+          <w:rFonts w:ascii="Helvetica" w:hAnsi="Helvetica"/>
+          <w:sz w:val="20"/>
+          <w:szCs w:val="20"/>
+        </w:rPr>
+        <w:t xml:space="preserve"> (MQ-7) </w:t>
+      </w:r>
+      <w:proofErr w:type="spellStart"/>
+      <w:r>
+        <w:rPr>
+          <w:rFonts w:ascii="Helvetica" w:hAnsi="Helvetica"/>
+          <w:sz w:val="20"/>
+          <w:szCs w:val="20"/>
+        </w:rPr>
+        <w:t>and</w:t>
+      </w:r>
+      <w:proofErr w:type="spellEnd"/>
+      <w:r>
+        <w:rPr>
+          <w:rFonts w:ascii="Helvetica" w:hAnsi="Helvetica"/>
+          <w:sz w:val="20"/>
+          <w:szCs w:val="20"/>
+        </w:rPr>
+        <w:t xml:space="preserve"> trigger a DC fan </w:t>
+      </w:r>
+      <w:proofErr w:type="spellStart"/>
+      <w:r>
+        <w:rPr>
+          <w:rFonts w:ascii="Helvetica" w:hAnsi="Helvetica"/>
+          <w:sz w:val="20"/>
+          <w:szCs w:val="20"/>
+        </w:rPr>
+        <w:t>and</w:t>
+      </w:r>
+      <w:proofErr w:type="spellEnd"/>
+      <w:r>
+        <w:rPr>
+          <w:rFonts w:ascii="Helvetica" w:hAnsi="Helvetica"/>
+          <w:sz w:val="20"/>
+          <w:szCs w:val="20"/>
+        </w:rPr>
+        <w:t xml:space="preserve"> </w:t>
+      </w:r>
+      <w:proofErr w:type="spellStart"/>
+      <w:r>
+        <w:rPr>
+          <w:rFonts w:ascii="Helvetica" w:hAnsi="Helvetica"/>
+          <w:sz w:val="20"/>
+          <w:szCs w:val="20"/>
+        </w:rPr>
+        <w:t>servo-driven</w:t>
+      </w:r>
+      <w:proofErr w:type="spellEnd"/>
+      <w:r>
+        <w:rPr>
+          <w:rFonts w:ascii="Helvetica" w:hAnsi="Helvetica"/>
+          <w:sz w:val="20"/>
+          <w:szCs w:val="20"/>
+        </w:rPr>
+        <w:t xml:space="preserve"> </w:t>
+      </w:r>
+      <w:proofErr w:type="spellStart"/>
+      <w:r>
+        <w:rPr>
+          <w:rFonts w:ascii="Helvetica" w:hAnsi="Helvetica"/>
+          <w:sz w:val="20"/>
+          <w:szCs w:val="20"/>
+        </w:rPr>
+        <w:t>window</w:t>
+      </w:r>
+      <w:proofErr w:type="spellEnd"/>
+      <w:r>
+        <w:rPr>
+          <w:rFonts w:ascii="Helvetica" w:hAnsi="Helvetica"/>
+          <w:sz w:val="20"/>
+          <w:szCs w:val="20"/>
+        </w:rPr>
+        <w:t>.</w:t>
       </w:r>
     </w:p>
     <w:p>
@@ -552,7 +1381,38 @@
           <w:szCs w:val="20"/>
           <w:lang w:val="en-US"/>
         </w:rPr>
-        <w:t>Structured the C++ firmware into modular OOP classes, utilizing a time-based millis() state machine to enable concurrent sensor reading and smooth, incremental servo actuation.</w:t>
+        <w:t xml:space="preserve">Structured the C++ firmware into modular OOP classes, utilizing a time-based </w:t>
+      </w:r>
+      <w:proofErr w:type="spellStart"/>
+      <w:proofErr w:type="gramStart"/>
+      <w:r>
+        <w:rPr>
+          <w:rFonts w:ascii="Helvetica" w:hAnsi="Helvetica"/>
+          <w:sz w:val="20"/>
+          <w:szCs w:val="20"/>
+          <w:lang w:val="en-US"/>
+        </w:rPr>
+        <w:t>millis</w:t>
+      </w:r>
+      <w:proofErr w:type="spellEnd"/>
+      <w:r>
+        <w:rPr>
+          <w:rFonts w:ascii="Helvetica" w:hAnsi="Helvetica"/>
+          <w:sz w:val="20"/>
+          <w:szCs w:val="20"/>
+          <w:lang w:val="en-US"/>
+        </w:rPr>
+        <w:t>(</w:t>
+      </w:r>
+      <w:proofErr w:type="gramEnd"/>
+      <w:r>
+        <w:rPr>
+          <w:rFonts w:ascii="Helvetica" w:hAnsi="Helvetica"/>
+          <w:sz w:val="20"/>
+          <w:szCs w:val="20"/>
+          <w:lang w:val="en-US"/>
+        </w:rPr>
+        <w:t>) state machine to enable concurrent sensor reading and smooth, incremental servo actuation.</w:t>
       </w:r>
     </w:p>
     <w:p>
@@ -569,14 +1429,257 @@
           <w:lang w:val="en-US"/>
         </w:rPr>
       </w:pPr>
-      <w:r>
-        <w:rPr>
-          <w:rFonts w:ascii="Helvetica" w:hAnsi="Helvetica"/>
-          <w:sz w:val="20"/>
-          <w:szCs w:val="20"/>
-          <w:lang w:val="en-US"/>
-        </w:rPr>
-        <w:t>Implemented an autonomous recovery cycle that continuously evaluates air quality, automatically resetting actuators (closing the window and stopping the fan) once the gas concentration drops below a safely calibrated threshold.</w:t>
+      <w:proofErr w:type="spellStart"/>
+      <w:r>
+        <w:rPr>
+          <w:rFonts w:ascii="Helvetica" w:hAnsi="Helvetica"/>
+          <w:sz w:val="20"/>
+          <w:szCs w:val="20"/>
+        </w:rPr>
+        <w:t>Implemented</w:t>
+      </w:r>
+      <w:proofErr w:type="spellEnd"/>
+      <w:r>
+        <w:rPr>
+          <w:rFonts w:ascii="Helvetica" w:hAnsi="Helvetica"/>
+          <w:sz w:val="20"/>
+          <w:szCs w:val="20"/>
+        </w:rPr>
+        <w:t xml:space="preserve"> an </w:t>
+      </w:r>
+      <w:proofErr w:type="spellStart"/>
+      <w:r>
+        <w:rPr>
+          <w:rFonts w:ascii="Helvetica" w:hAnsi="Helvetica"/>
+          <w:sz w:val="20"/>
+          <w:szCs w:val="20"/>
+        </w:rPr>
+        <w:t>autonomous</w:t>
+      </w:r>
+      <w:proofErr w:type="spellEnd"/>
+      <w:r>
+        <w:rPr>
+          <w:rFonts w:ascii="Helvetica" w:hAnsi="Helvetica"/>
+          <w:sz w:val="20"/>
+          <w:szCs w:val="20"/>
+        </w:rPr>
+        <w:t xml:space="preserve"> </w:t>
+      </w:r>
+      <w:proofErr w:type="spellStart"/>
+      <w:r>
+        <w:rPr>
+          <w:rFonts w:ascii="Helvetica" w:hAnsi="Helvetica"/>
+          <w:sz w:val="20"/>
+          <w:szCs w:val="20"/>
+        </w:rPr>
+        <w:t>recovery</w:t>
+      </w:r>
+      <w:proofErr w:type="spellEnd"/>
+      <w:r>
+        <w:rPr>
+          <w:rFonts w:ascii="Helvetica" w:hAnsi="Helvetica"/>
+          <w:sz w:val="20"/>
+          <w:szCs w:val="20"/>
+        </w:rPr>
+        <w:t xml:space="preserve"> </w:t>
+      </w:r>
+      <w:proofErr w:type="spellStart"/>
+      <w:r>
+        <w:rPr>
+          <w:rFonts w:ascii="Helvetica" w:hAnsi="Helvetica"/>
+          <w:sz w:val="20"/>
+          <w:szCs w:val="20"/>
+        </w:rPr>
+        <w:t>cycle</w:t>
+      </w:r>
+      <w:proofErr w:type="spellEnd"/>
+      <w:r>
+        <w:rPr>
+          <w:rFonts w:ascii="Helvetica" w:hAnsi="Helvetica"/>
+          <w:sz w:val="20"/>
+          <w:szCs w:val="20"/>
+        </w:rPr>
+        <w:t xml:space="preserve"> </w:t>
+      </w:r>
+      <w:proofErr w:type="spellStart"/>
+      <w:r>
+        <w:rPr>
+          <w:rFonts w:ascii="Helvetica" w:hAnsi="Helvetica"/>
+          <w:sz w:val="20"/>
+          <w:szCs w:val="20"/>
+        </w:rPr>
+        <w:t>that</w:t>
+      </w:r>
+      <w:proofErr w:type="spellEnd"/>
+      <w:r>
+        <w:rPr>
+          <w:rFonts w:ascii="Helvetica" w:hAnsi="Helvetica"/>
+          <w:sz w:val="20"/>
+          <w:szCs w:val="20"/>
+        </w:rPr>
+        <w:t xml:space="preserve"> </w:t>
+      </w:r>
+      <w:proofErr w:type="spellStart"/>
+      <w:r>
+        <w:rPr>
+          <w:rFonts w:ascii="Helvetica" w:hAnsi="Helvetica"/>
+          <w:sz w:val="20"/>
+          <w:szCs w:val="20"/>
+        </w:rPr>
+        <w:t>continuously</w:t>
+      </w:r>
+      <w:proofErr w:type="spellEnd"/>
+      <w:r>
+        <w:rPr>
+          <w:rFonts w:ascii="Helvetica" w:hAnsi="Helvetica"/>
+          <w:sz w:val="20"/>
+          <w:szCs w:val="20"/>
+        </w:rPr>
+        <w:t xml:space="preserve"> </w:t>
+      </w:r>
+      <w:proofErr w:type="spellStart"/>
+      <w:r>
+        <w:rPr>
+          <w:rFonts w:ascii="Helvetica" w:hAnsi="Helvetica"/>
+          <w:sz w:val="20"/>
+          <w:szCs w:val="20"/>
+        </w:rPr>
+        <w:t>evaluates</w:t>
+      </w:r>
+      <w:proofErr w:type="spellEnd"/>
+      <w:r>
+        <w:rPr>
+          <w:rFonts w:ascii="Helvetica" w:hAnsi="Helvetica"/>
+          <w:sz w:val="20"/>
+          <w:szCs w:val="20"/>
+        </w:rPr>
+        <w:t xml:space="preserve"> </w:t>
+      </w:r>
+      <w:proofErr w:type="spellStart"/>
+      <w:r>
+        <w:rPr>
+          <w:rFonts w:ascii="Helvetica" w:hAnsi="Helvetica"/>
+          <w:sz w:val="20"/>
+          <w:szCs w:val="20"/>
+        </w:rPr>
+        <w:t>air</w:t>
+      </w:r>
+      <w:proofErr w:type="spellEnd"/>
+      <w:r>
+        <w:rPr>
+          <w:rFonts w:ascii="Helvetica" w:hAnsi="Helvetica"/>
+          <w:sz w:val="20"/>
+          <w:szCs w:val="20"/>
+        </w:rPr>
+        <w:t xml:space="preserve"> quality, </w:t>
+      </w:r>
+      <w:proofErr w:type="spellStart"/>
+      <w:r>
+        <w:rPr>
+          <w:rFonts w:ascii="Helvetica" w:hAnsi="Helvetica"/>
+          <w:sz w:val="20"/>
+          <w:szCs w:val="20"/>
+        </w:rPr>
+        <w:t>resetting</w:t>
+      </w:r>
+      <w:proofErr w:type="spellEnd"/>
+      <w:r>
+        <w:rPr>
+          <w:rFonts w:ascii="Helvetica" w:hAnsi="Helvetica"/>
+          <w:sz w:val="20"/>
+          <w:szCs w:val="20"/>
+        </w:rPr>
+        <w:t xml:space="preserve"> </w:t>
+      </w:r>
+      <w:proofErr w:type="spellStart"/>
+      <w:r>
+        <w:rPr>
+          <w:rFonts w:ascii="Helvetica" w:hAnsi="Helvetica"/>
+          <w:sz w:val="20"/>
+          <w:szCs w:val="20"/>
+        </w:rPr>
+        <w:t>actuators</w:t>
+      </w:r>
+      <w:proofErr w:type="spellEnd"/>
+      <w:r>
+        <w:rPr>
+          <w:rFonts w:ascii="Helvetica" w:hAnsi="Helvetica"/>
+          <w:sz w:val="20"/>
+          <w:szCs w:val="20"/>
+        </w:rPr>
+        <w:t xml:space="preserve"> </w:t>
+      </w:r>
+      <w:proofErr w:type="spellStart"/>
+      <w:r>
+        <w:rPr>
+          <w:rFonts w:ascii="Helvetica" w:hAnsi="Helvetica"/>
+          <w:sz w:val="20"/>
+          <w:szCs w:val="20"/>
+        </w:rPr>
+        <w:t>once</w:t>
+      </w:r>
+      <w:proofErr w:type="spellEnd"/>
+      <w:r>
+        <w:rPr>
+          <w:rFonts w:ascii="Helvetica" w:hAnsi="Helvetica"/>
+          <w:sz w:val="20"/>
+          <w:szCs w:val="20"/>
+        </w:rPr>
+        <w:t xml:space="preserve"> gas </w:t>
+      </w:r>
+      <w:proofErr w:type="spellStart"/>
+      <w:r>
+        <w:rPr>
+          <w:rFonts w:ascii="Helvetica" w:hAnsi="Helvetica"/>
+          <w:sz w:val="20"/>
+          <w:szCs w:val="20"/>
+        </w:rPr>
+        <w:t>concentration</w:t>
+      </w:r>
+      <w:proofErr w:type="spellEnd"/>
+      <w:r>
+        <w:rPr>
+          <w:rFonts w:ascii="Helvetica" w:hAnsi="Helvetica"/>
+          <w:sz w:val="20"/>
+          <w:szCs w:val="20"/>
+        </w:rPr>
+        <w:t xml:space="preserve"> drops </w:t>
+      </w:r>
+      <w:proofErr w:type="spellStart"/>
+      <w:r>
+        <w:rPr>
+          <w:rFonts w:ascii="Helvetica" w:hAnsi="Helvetica"/>
+          <w:sz w:val="20"/>
+          <w:szCs w:val="20"/>
+        </w:rPr>
+        <w:t>below</w:t>
+      </w:r>
+      <w:proofErr w:type="spellEnd"/>
+      <w:r>
+        <w:rPr>
+          <w:rFonts w:ascii="Helvetica" w:hAnsi="Helvetica"/>
+          <w:sz w:val="20"/>
+          <w:szCs w:val="20"/>
+        </w:rPr>
+        <w:t xml:space="preserve"> safe </w:t>
+      </w:r>
+      <w:proofErr w:type="spellStart"/>
+      <w:r>
+        <w:rPr>
+          <w:rFonts w:ascii="Helvetica" w:hAnsi="Helvetica"/>
+          <w:sz w:val="20"/>
+          <w:szCs w:val="20"/>
+        </w:rPr>
+        <w:t>thresholds</w:t>
+      </w:r>
+      <w:proofErr w:type="spellEnd"/>
+      <w:r>
+        <w:rPr>
+          <w:rFonts w:ascii="Helvetica" w:hAnsi="Helvetica"/>
+          <w:sz w:val="20"/>
+          <w:szCs w:val="20"/>
+        </w:rPr>
+        <w:t>.</w:t>
       </w:r>
     </w:p>
     <w:p>
@@ -618,14 +1721,26 @@
           <w:szCs w:val="20"/>
           <w:lang w:val="en-US"/>
         </w:rPr>
-        <w:t>Embedded C++, SPI, Bluetooth, Hardware Interrupts</w:t>
+        <w:t xml:space="preserve">Embedded C++, SPI, </w:t>
+      </w:r>
+      <w:r>
+        <w:rPr>
+          <w:rFonts w:ascii="Helvetica" w:hAnsi="Helvetica"/>
+          <w:i/>
+          <w:iCs/>
+          <w:sz w:val="20"/>
+          <w:szCs w:val="20"/>
+          <w:lang w:val="en-US"/>
+        </w:rPr>
+        <w:t>ISRs</w:t>
       </w:r>
     </w:p>
     <w:p>
       <w:pPr>
+        <w:pStyle w:val="Listparagraf"/>
         <w:numPr>
           <w:ilvl w:val="0"/>
-          <w:numId w:val="3"/>
+          <w:numId w:val="16"/>
         </w:numPr>
         <w:spacing w:after="0"/>
         <w:rPr>
@@ -642,39 +1757,15 @@
           <w:szCs w:val="20"/>
           <w:lang w:val="en-US"/>
         </w:rPr>
-        <w:t>Developed a distributed IoT automation system utilizing two Arduino microcontrollers communicating via the Master/Slave SPI protocol</w:t>
-      </w:r>
-      <w:r>
-        <w:rPr>
-          <w:rFonts w:ascii="Helvetica" w:hAnsi="Helvetica"/>
-          <w:sz w:val="20"/>
-          <w:szCs w:val="20"/>
-          <w:lang w:val="en-US"/>
-        </w:rPr>
-        <w:t xml:space="preserve">, </w:t>
-      </w:r>
-      <w:r>
-        <w:rPr>
-          <w:rFonts w:ascii="Helvetica" w:hAnsi="Helvetica"/>
-          <w:sz w:val="20"/>
-          <w:szCs w:val="20"/>
-        </w:rPr>
-        <w:t>allowing an Arduino (Master) processing environmental data (Bluetooth, DHT11) to control a second Arduino (Slave) managing irrigation logic</w:t>
-      </w:r>
-      <w:r>
-        <w:rPr>
-          <w:rFonts w:ascii="Helvetica" w:hAnsi="Helvetica"/>
-          <w:sz w:val="20"/>
-          <w:szCs w:val="20"/>
-        </w:rPr>
-        <w:t>.</w:t>
+        <w:t>Developed a distributed IoT irrigation system using two Arduino microcontrollers communicating via Master/Slave SPI, where the Master processes environmental data (Bluetooth, DHT11) to control the Slave.</w:t>
       </w:r>
     </w:p>
     <w:p>
       <w:pPr>
+        <w:pStyle w:val="Listparagraf"/>
         <w:numPr>
           <w:ilvl w:val="0"/>
-          <w:numId w:val="3"/>
+          <w:numId w:val="16"/>
         </w:numPr>
         <w:spacing w:after="0"/>
         <w:rPr>
@@ -691,14 +1782,15 @@
           <w:szCs w:val="20"/>
           <w:lang w:val="en-US"/>
         </w:rPr>
-        <w:t>Programmed hardware timers (Timer1) and Interrupt Service Routines (ISRs) to instantly override actuators based on real-time PIR motion detection, ensuring fail-safe operation.</w:t>
+        <w:t>Implemented hardware timers and Interrupt Service Routines (ISRs) for real-time PIR motion detection, instantly overriding actuators for fail-safe operation.</w:t>
       </w:r>
     </w:p>
     <w:p>
       <w:pPr>
+        <w:pStyle w:val="Listparagraf"/>
         <w:numPr>
           <w:ilvl w:val="0"/>
-          <w:numId w:val="3"/>
+          <w:numId w:val="16"/>
         </w:numPr>
         <w:spacing w:after="0"/>
         <w:rPr>
@@ -715,7 +1807,7 @@
           <w:szCs w:val="20"/>
           <w:lang w:val="en-US"/>
         </w:rPr>
-        <w:t>Structured the embedded codebase strictly using Object-Oriented C++ principles, encapsulating hardware states into reusable, modular classes.</w:t>
+        <w:t>Structured the embedded C++ codebase using Object-Oriented principles, encapsulating hardware states into reusable, modular classes.</w:t>
       </w:r>
     </w:p>
     <w:p>
@@ -723,13 +1815,31 @@
         <w:spacing w:after="0"/>
         <w:rPr>
           <w:rFonts w:ascii="Helvetica" w:hAnsi="Helvetica"/>
+          <w:sz w:val="20"/>
+          <w:szCs w:val="20"/>
+          <w:lang w:val="en-US"/>
+        </w:rPr>
+      </w:pPr>
+      <w:r>
+        <w:rPr>
+          <w:rFonts w:ascii="Helvetica" w:hAnsi="Helvetica"/>
           <w:b/>
           <w:bCs/>
           <w:sz w:val="20"/>
           <w:szCs w:val="20"/>
           <w:lang w:val="en-US"/>
         </w:rPr>
-      </w:pPr>
+        <w:t xml:space="preserve">Enterprise Cloud Calendar System </w:t>
+      </w:r>
+      <w:r>
+        <w:rPr>
+          <w:rFonts w:ascii="Helvetica" w:hAnsi="Helvetica"/>
+          <w:sz w:val="20"/>
+          <w:szCs w:val="20"/>
+          <w:lang w:val="en-US"/>
+        </w:rPr>
+        <w:t>|</w:t>
+      </w:r>
       <w:r>
         <w:rPr>
           <w:rFonts w:ascii="Helvetica" w:hAnsi="Helvetica"/>
@@ -739,134 +1849,7 @@
           <w:szCs w:val="20"/>
           <w:lang w:val="en-US"/>
         </w:rPr>
-        <w:t xml:space="preserve">Algorithmic Data Pipeline ("The Royal Hunt") | </w:t>
-      </w:r>
-      <w:r>
-        <w:rPr>
-          <w:rFonts w:ascii="Helvetica" w:hAnsi="Helvetica"/>
-          <w:i/>
-          <w:iCs/>
-          <w:sz w:val="20"/>
-          <w:szCs w:val="20"/>
-          <w:lang w:val="en-US"/>
-        </w:rPr>
-        <w:t>C, A</w:t>
-      </w:r>
-      <w:r>
-        <w:rPr>
-          <w:rFonts w:ascii="Helvetica" w:hAnsi="Helvetica"/>
-          <w:i/>
-          <w:iCs/>
-          <w:sz w:val="20"/>
-          <w:szCs w:val="20"/>
-          <w:lang w:val="en-US"/>
-        </w:rPr>
-        <w:t xml:space="preserve">lgorithms &amp; </w:t>
-      </w:r>
-      <w:r>
-        <w:rPr>
-          <w:rFonts w:ascii="Helvetica" w:hAnsi="Helvetica"/>
-          <w:i/>
-          <w:iCs/>
-          <w:sz w:val="20"/>
-          <w:szCs w:val="20"/>
-          <w:lang w:val="en-US"/>
-        </w:rPr>
-        <w:t>Data Structures</w:t>
-      </w:r>
-    </w:p>
-    <w:p>
-      <w:pPr>
-        <w:numPr>
-          <w:ilvl w:val="0"/>
-          <w:numId w:val="4"/>
-        </w:numPr>
-        <w:spacing w:after="0"/>
-        <w:rPr>
-          <w:rFonts w:ascii="Helvetica" w:hAnsi="Helvetica"/>
-          <w:sz w:val="20"/>
-          <w:szCs w:val="20"/>
-          <w:lang w:val="en-US"/>
-        </w:rPr>
-      </w:pPr>
-      <w:r>
-        <w:rPr>
-          <w:rFonts w:ascii="Helvetica" w:hAnsi="Helvetica"/>
-          <w:sz w:val="20"/>
-          <w:szCs w:val="20"/>
-          <w:lang w:val="en-US"/>
-        </w:rPr>
-        <w:t>Architected a multi-stage data processing pipeline in C, intelligently chaining Queues and Binary Search Trees (BST) to parse, filter, and sort raw data extracted from CSV files.</w:t>
-      </w:r>
-    </w:p>
-    <w:p>
-      <w:pPr>
-        <w:numPr>
-          <w:ilvl w:val="0"/>
-          <w:numId w:val="4"/>
-        </w:numPr>
-        <w:spacing w:after="0"/>
-        <w:rPr>
-          <w:rFonts w:ascii="Helvetica" w:hAnsi="Helvetica"/>
-          <w:sz w:val="20"/>
-          <w:szCs w:val="20"/>
-          <w:lang w:val="en-US"/>
-        </w:rPr>
-      </w:pPr>
-      <w:r>
-        <w:rPr>
-          <w:rFonts w:ascii="Helvetica" w:hAnsi="Helvetica"/>
-          <w:sz w:val="20"/>
-          <w:szCs w:val="20"/>
-          <w:lang w:val="en-US"/>
-        </w:rPr>
-        <w:t>Optimized data retrieval and dynamic ranking by implementing Hash Tables for O(1) record lookups and Max Heaps to efficiently update attributes and extract top-performing entities.</w:t>
-      </w:r>
-    </w:p>
-    <w:p>
-      <w:pPr>
-        <w:numPr>
-          <w:ilvl w:val="0"/>
-          <w:numId w:val="4"/>
-        </w:numPr>
-        <w:spacing w:after="0"/>
-        <w:rPr>
-          <w:rFonts w:ascii="Helvetica" w:hAnsi="Helvetica"/>
-          <w:sz w:val="20"/>
-          <w:szCs w:val="20"/>
-          <w:lang w:val="en-US"/>
-        </w:rPr>
-      </w:pPr>
-      <w:r>
-        <w:rPr>
-          <w:rFonts w:ascii="Helvetica" w:hAnsi="Helvetica"/>
-          <w:sz w:val="20"/>
-          <w:szCs w:val="20"/>
-          <w:lang w:val="en-US"/>
-        </w:rPr>
-        <w:t>Implemented Depth-First Search (DFS) graph traversal algorithms to calculate and evaluate all valid network routes for automated entity assignment based on dynamic criteria.</w:t>
-      </w:r>
-    </w:p>
-    <w:p>
-      <w:pPr>
-        <w:spacing w:after="0"/>
-        <w:rPr>
-          <w:rFonts w:ascii="Helvetica" w:hAnsi="Helvetica"/>
-          <w:sz w:val="20"/>
-          <w:szCs w:val="20"/>
-          <w:lang w:val="en-US"/>
-        </w:rPr>
-      </w:pPr>
-      <w:r>
-        <w:rPr>
-          <w:rFonts w:ascii="Helvetica" w:hAnsi="Helvetica"/>
-          <w:b/>
-          <w:bCs/>
-          <w:sz w:val="20"/>
-          <w:szCs w:val="20"/>
-          <w:lang w:val="en-US"/>
-        </w:rPr>
-        <w:t xml:space="preserve">Enterprise Cloud Calendar System | </w:t>
+        <w:t xml:space="preserve"> </w:t>
       </w:r>
       <w:r>
         <w:rPr>
@@ -901,7 +1884,49 @@
           <w:szCs w:val="20"/>
           <w:lang w:val="en-US"/>
         </w:rPr>
-        <w:t>Developed a cloud-based calendar scheduling application in Java (similar to Google Calendar), implementing a robust object-oriented architecture to manage overlapping events, fixed-duration meetings, and participant responses.</w:t>
+        <w:t>Developed a cloud-based calendar scheduling application in Java (</w:t>
+      </w:r>
+      <w:proofErr w:type="gramStart"/>
+      <w:r>
+        <w:rPr>
+          <w:rFonts w:ascii="Helvetica" w:hAnsi="Helvetica"/>
+          <w:sz w:val="20"/>
+          <w:szCs w:val="20"/>
+          <w:lang w:val="en-US"/>
+        </w:rPr>
+        <w:t>similar to</w:t>
+      </w:r>
+      <w:proofErr w:type="gramEnd"/>
+      <w:r>
+        <w:rPr>
+          <w:rFonts w:ascii="Helvetica" w:hAnsi="Helvetica"/>
+          <w:sz w:val="20"/>
+          <w:szCs w:val="20"/>
+          <w:lang w:val="en-US"/>
+        </w:rPr>
+        <w:t xml:space="preserve"> Google Calendar), implementing </w:t>
+      </w:r>
+      <w:proofErr w:type="spellStart"/>
+      <w:proofErr w:type="gramStart"/>
+      <w:r>
+        <w:rPr>
+          <w:rFonts w:ascii="Helvetica" w:hAnsi="Helvetica"/>
+          <w:sz w:val="20"/>
+          <w:szCs w:val="20"/>
+          <w:lang w:val="en-US"/>
+        </w:rPr>
+        <w:t>a</w:t>
+      </w:r>
+      <w:proofErr w:type="spellEnd"/>
+      <w:proofErr w:type="gramEnd"/>
+      <w:r>
+        <w:rPr>
+          <w:rFonts w:ascii="Helvetica" w:hAnsi="Helvetica"/>
+          <w:sz w:val="20"/>
+          <w:szCs w:val="20"/>
+          <w:lang w:val="en-US"/>
+        </w:rPr>
+        <w:t xml:space="preserve"> object-oriented architecture to manage overlapping events, fixed-duration meetings, and participant responses.</w:t>
       </w:r>
     </w:p>
     <w:p>
@@ -980,11 +2005,75 @@
           <w:szCs w:val="20"/>
           <w:lang w:val="en-US"/>
         </w:rPr>
-        <w:t xml:space="preserve"> | Netica, Clingo, Algorithmic Search</w:t>
+        <w:t xml:space="preserve"> | </w:t>
+      </w:r>
+      <w:proofErr w:type="spellStart"/>
+      <w:r>
+        <w:rPr>
+          <w:rFonts w:ascii="Helvetica" w:hAnsi="Helvetica"/>
+          <w:i/>
+          <w:iCs/>
+          <w:sz w:val="20"/>
+          <w:szCs w:val="20"/>
+          <w:lang w:val="en-US"/>
+        </w:rPr>
+        <w:t>Netica</w:t>
+      </w:r>
+      <w:proofErr w:type="spellEnd"/>
+      <w:r>
+        <w:rPr>
+          <w:rFonts w:ascii="Helvetica" w:hAnsi="Helvetica"/>
+          <w:i/>
+          <w:iCs/>
+          <w:sz w:val="20"/>
+          <w:szCs w:val="20"/>
+          <w:lang w:val="en-US"/>
+        </w:rPr>
+        <w:t xml:space="preserve">, </w:t>
+      </w:r>
+      <w:proofErr w:type="spellStart"/>
+      <w:r>
+        <w:rPr>
+          <w:rFonts w:ascii="Helvetica" w:hAnsi="Helvetica"/>
+          <w:i/>
+          <w:iCs/>
+          <w:sz w:val="20"/>
+          <w:szCs w:val="20"/>
+          <w:lang w:val="en-US"/>
+        </w:rPr>
+        <w:t>Clingo</w:t>
+      </w:r>
+      <w:proofErr w:type="spellEnd"/>
+      <w:r>
+        <w:rPr>
+          <w:rFonts w:ascii="Helvetica" w:hAnsi="Helvetica"/>
+          <w:i/>
+          <w:iCs/>
+          <w:sz w:val="20"/>
+          <w:szCs w:val="20"/>
+          <w:lang w:val="en-US"/>
+        </w:rPr>
+        <w:t>, A</w:t>
+      </w:r>
+      <w:r>
+        <w:rPr>
+          <w:rFonts w:ascii="Helvetica" w:hAnsi="Helvetica"/>
+          <w:i/>
+          <w:iCs/>
+          <w:sz w:val="20"/>
+          <w:szCs w:val="20"/>
+          <w:lang w:val="en-US"/>
+        </w:rPr>
+        <w:t>*, Simulated Annealing</w:t>
       </w:r>
     </w:p>
     <w:p>
       <w:pPr>
+        <w:pStyle w:val="Listparagraf"/>
+        <w:numPr>
+          <w:ilvl w:val="0"/>
+          <w:numId w:val="17"/>
+        </w:numPr>
         <w:spacing w:after="0"/>
         <w:rPr>
           <w:rFonts w:ascii="Helvetica" w:hAnsi="Helvetica"/>
@@ -1000,7 +2089,27 @@
           <w:szCs w:val="20"/>
           <w:lang w:val="en-US"/>
         </w:rPr>
-        <w:t>• Implemented optimization &amp; search algorithms (Simulated Annealing, A*, MinMax), Logic Programming, and Bayesian Networks for predictive modeling.</w:t>
+        <w:t xml:space="preserve">Implemented optimization &amp; search algorithms (Simulated Annealing, A*, </w:t>
+      </w:r>
+      <w:proofErr w:type="spellStart"/>
+      <w:r>
+        <w:rPr>
+          <w:rFonts w:ascii="Helvetica" w:hAnsi="Helvetica"/>
+          <w:sz w:val="20"/>
+          <w:szCs w:val="20"/>
+          <w:lang w:val="en-US"/>
+        </w:rPr>
+        <w:t>MinMax</w:t>
+      </w:r>
+      <w:proofErr w:type="spellEnd"/>
+      <w:r>
+        <w:rPr>
+          <w:rFonts w:ascii="Helvetica" w:hAnsi="Helvetica"/>
+          <w:sz w:val="20"/>
+          <w:szCs w:val="20"/>
+          <w:lang w:val="en-US"/>
+        </w:rPr>
+        <w:t>), Logic Programming, and Bayesian Networks for predictive modeling.</w:t>
       </w:r>
     </w:p>
     <w:p>
@@ -1008,6 +2117,17 @@
         <w:spacing w:after="0"/>
         <w:rPr>
           <w:rFonts w:ascii="Helvetica" w:hAnsi="Helvetica"/>
+          <w:sz w:val="20"/>
+          <w:szCs w:val="20"/>
+          <w:lang w:val="en-US"/>
+        </w:rPr>
+      </w:pPr>
+    </w:p>
+    <w:p>
+      <w:pPr>
+        <w:spacing w:after="0"/>
+        <w:rPr>
+          <w:rFonts w:ascii="Helvetica" w:hAnsi="Helvetica"/>
           <w:b/>
           <w:bCs/>
           <w:sz w:val="20"/>
@@ -1024,7 +2144,6 @@
           <w:szCs w:val="20"/>
           <w:lang w:val="en-US"/>
         </w:rPr>
-        <w:lastRenderedPageBreak/>
         <w:t>EDUCATION</w:t>
       </w:r>
     </w:p>
@@ -1038,6 +2157,7 @@
           <w:lang w:val="en-US"/>
         </w:rPr>
       </w:pPr>
+      <w:proofErr w:type="spellStart"/>
       <w:r>
         <w:rPr>
           <w:rFonts w:ascii="Helvetica" w:hAnsi="Helvetica"/>
@@ -1046,8 +2166,53 @@
           <w:sz w:val="20"/>
           <w:szCs w:val="20"/>
         </w:rPr>
-        <w:t>Faculty of Automatic Control and Computers</w:t>
-      </w:r>
+        <w:t>Faculty</w:t>
+      </w:r>
+      <w:proofErr w:type="spellEnd"/>
+      <w:r>
+        <w:rPr>
+          <w:rFonts w:ascii="Helvetica" w:hAnsi="Helvetica"/>
+          <w:b/>
+          <w:bCs/>
+          <w:sz w:val="20"/>
+          <w:szCs w:val="20"/>
+        </w:rPr>
+        <w:t xml:space="preserve"> of Automatic Control </w:t>
+      </w:r>
+      <w:proofErr w:type="spellStart"/>
+      <w:r>
+        <w:rPr>
+          <w:rFonts w:ascii="Helvetica" w:hAnsi="Helvetica"/>
+          <w:b/>
+          <w:bCs/>
+          <w:sz w:val="20"/>
+          <w:szCs w:val="20"/>
+        </w:rPr>
+        <w:t>and</w:t>
+      </w:r>
+      <w:proofErr w:type="spellEnd"/>
+      <w:r>
+        <w:rPr>
+          <w:rFonts w:ascii="Helvetica" w:hAnsi="Helvetica"/>
+          <w:b/>
+          <w:bCs/>
+          <w:sz w:val="20"/>
+          <w:szCs w:val="20"/>
+        </w:rPr>
+        <w:t xml:space="preserve"> </w:t>
+      </w:r>
+      <w:proofErr w:type="spellStart"/>
+      <w:r>
+        <w:rPr>
+          <w:rFonts w:ascii="Helvetica" w:hAnsi="Helvetica"/>
+          <w:b/>
+          <w:bCs/>
+          <w:sz w:val="20"/>
+          <w:szCs w:val="20"/>
+        </w:rPr>
+        <w:t>Computers</w:t>
+      </w:r>
+      <w:proofErr w:type="spellEnd"/>
       <w:r>
         <w:rPr>
           <w:rFonts w:ascii="Helvetica" w:hAnsi="Helvetica" w:cs="Arial"/>
@@ -1068,8 +2233,20 @@
           <w:sz w:val="20"/>
           <w:szCs w:val="20"/>
         </w:rPr>
-        <w:t>, University POLITEHNICA of Bucharest</w:t>
-      </w:r>
+        <w:t xml:space="preserve">, University POLITEHNICA of </w:t>
+      </w:r>
+      <w:proofErr w:type="spellStart"/>
+      <w:r>
+        <w:rPr>
+          <w:rFonts w:ascii="Helvetica" w:hAnsi="Helvetica"/>
+          <w:b/>
+          <w:bCs/>
+          <w:sz w:val="20"/>
+          <w:szCs w:val="20"/>
+        </w:rPr>
+        <w:t>Bucharest</w:t>
+      </w:r>
+      <w:proofErr w:type="spellEnd"/>
       <w:r>
         <w:rPr>
           <w:rFonts w:ascii="Helvetica" w:hAnsi="Helvetica"/>
@@ -1096,22 +2273,134 @@
           <w:szCs w:val="20"/>
           <w:lang w:val="en-US"/>
         </w:rPr>
-        <w:t>Expected 202</w:t>
-      </w:r>
-      <w:r>
+        <w:t>Expected 2028</w:t>
+      </w:r>
+    </w:p>
+    <w:p>
+      <w:pPr>
+        <w:spacing w:after="0"/>
         <w:rPr>
           <w:rFonts w:ascii="Helvetica" w:hAnsi="Helvetica"/>
           <w:i/>
           <w:iCs/>
           <w:sz w:val="20"/>
           <w:szCs w:val="20"/>
-          <w:lang w:val="en-US"/>
-        </w:rPr>
-        <w:t>8</w:t>
+        </w:rPr>
+      </w:pPr>
+      <w:r>
+        <w:rPr>
+          <w:rFonts w:ascii="Helvetica" w:hAnsi="Helvetica"/>
+          <w:sz w:val="20"/>
+          <w:szCs w:val="20"/>
+          <w:lang w:val="en-US"/>
+        </w:rPr>
+        <w:t xml:space="preserve">B.Sc. Systems Engineering </w:t>
+      </w:r>
+      <w:r>
+        <w:rPr>
+          <w:rFonts w:ascii="Helvetica" w:hAnsi="Helvetica"/>
+          <w:sz w:val="20"/>
+          <w:szCs w:val="20"/>
+          <w:lang w:val="en-US"/>
+        </w:rPr>
+        <w:t>(</w:t>
+      </w:r>
+      <w:proofErr w:type="spellStart"/>
+      <w:r>
+        <w:rPr>
+          <w:rFonts w:ascii="Helvetica" w:hAnsi="Helvetica"/>
+          <w:i/>
+          <w:iCs/>
+          <w:sz w:val="20"/>
+          <w:szCs w:val="20"/>
+        </w:rPr>
+        <w:t>Automation</w:t>
+      </w:r>
+      <w:proofErr w:type="spellEnd"/>
+      <w:r>
+        <w:rPr>
+          <w:rFonts w:ascii="Helvetica" w:hAnsi="Helvetica"/>
+          <w:i/>
+          <w:iCs/>
+          <w:sz w:val="20"/>
+          <w:szCs w:val="20"/>
+        </w:rPr>
+        <w:t xml:space="preserve"> </w:t>
+      </w:r>
+      <w:proofErr w:type="spellStart"/>
+      <w:r>
+        <w:rPr>
+          <w:rFonts w:ascii="Helvetica" w:hAnsi="Helvetica"/>
+          <w:i/>
+          <w:iCs/>
+          <w:sz w:val="20"/>
+          <w:szCs w:val="20"/>
+        </w:rPr>
+        <w:t>and</w:t>
+      </w:r>
+      <w:proofErr w:type="spellEnd"/>
+      <w:r>
+        <w:rPr>
+          <w:rFonts w:ascii="Helvetica" w:hAnsi="Helvetica"/>
+          <w:i/>
+          <w:iCs/>
+          <w:sz w:val="20"/>
+          <w:szCs w:val="20"/>
+        </w:rPr>
+        <w:t xml:space="preserve"> </w:t>
+      </w:r>
+      <w:proofErr w:type="spellStart"/>
+      <w:r>
+        <w:rPr>
+          <w:rFonts w:ascii="Helvetica" w:hAnsi="Helvetica"/>
+          <w:i/>
+          <w:iCs/>
+          <w:sz w:val="20"/>
+          <w:szCs w:val="20"/>
+        </w:rPr>
+        <w:t>applied</w:t>
+      </w:r>
+      <w:proofErr w:type="spellEnd"/>
+      <w:r>
+        <w:rPr>
+          <w:rFonts w:ascii="Helvetica" w:hAnsi="Helvetica"/>
+          <w:i/>
+          <w:iCs/>
+          <w:sz w:val="20"/>
+          <w:szCs w:val="20"/>
+        </w:rPr>
+        <w:t xml:space="preserve"> </w:t>
+      </w:r>
+      <w:proofErr w:type="spellStart"/>
+      <w:r>
+        <w:rPr>
+          <w:rFonts w:ascii="Helvetica" w:hAnsi="Helvetica"/>
+          <w:i/>
+          <w:iCs/>
+          <w:sz w:val="20"/>
+          <w:szCs w:val="20"/>
+        </w:rPr>
+        <w:t>informatics</w:t>
+      </w:r>
+      <w:proofErr w:type="spellEnd"/>
+      <w:r>
+        <w:rPr>
+          <w:rFonts w:ascii="Helvetica" w:hAnsi="Helvetica"/>
+          <w:i/>
+          <w:iCs/>
+          <w:sz w:val="20"/>
+          <w:szCs w:val="20"/>
+        </w:rPr>
+        <w:t>)</w:t>
       </w:r>
     </w:p>
     <w:p>
       <w:pPr>
+        <w:pStyle w:val="Listparagraf"/>
+        <w:numPr>
+          <w:ilvl w:val="0"/>
+          <w:numId w:val="17"/>
+        </w:numPr>
         <w:spacing w:after="0"/>
         <w:rPr>
           <w:rFonts w:ascii="Helvetica" w:hAnsi="Helvetica"/>
@@ -1119,26 +2408,9 @@
           <w:iCs/>
           <w:sz w:val="20"/>
           <w:szCs w:val="20"/>
-        </w:rPr>
-      </w:pPr>
-      <w:r>
-        <w:rPr>
-          <w:rFonts w:ascii="Helvetica" w:hAnsi="Helvetica"/>
-          <w:sz w:val="20"/>
-          <w:szCs w:val="20"/>
-          <w:lang w:val="en-US"/>
-        </w:rPr>
-        <w:t xml:space="preserve">B.Sc. Systems Engineering </w:t>
-      </w:r>
-      <w:r>
-        <w:rPr>
-          <w:rFonts w:ascii="Helvetica" w:hAnsi="Helvetica"/>
-          <w:sz w:val="20"/>
-          <w:szCs w:val="20"/>
-          <w:lang w:val="en-US"/>
-        </w:rPr>
-        <w:t>(</w:t>
-      </w:r>
+          <w:lang w:val="en-US"/>
+        </w:rPr>
+      </w:pPr>
       <w:r>
         <w:rPr>
           <w:rFonts w:ascii="Helvetica" w:hAnsi="Helvetica"/>
@@ -1146,63 +2418,9 @@
           <w:iCs/>
           <w:sz w:val="20"/>
           <w:szCs w:val="20"/>
-        </w:rPr>
-        <w:t>Automation and applied informatics</w:t>
-      </w:r>
-      <w:r>
-        <w:rPr>
-          <w:rFonts w:ascii="Helvetica" w:hAnsi="Helvetica"/>
-          <w:i/>
-          <w:iCs/>
-          <w:sz w:val="20"/>
-          <w:szCs w:val="20"/>
-        </w:rPr>
-        <w:t>)</w:t>
-      </w:r>
-    </w:p>
-    <w:p>
-      <w:pPr>
-        <w:spacing w:after="0"/>
-        <w:rPr>
-          <w:rFonts w:ascii="Helvetica" w:hAnsi="Helvetica"/>
-          <w:i/>
-          <w:iCs/>
-          <w:sz w:val="20"/>
-          <w:szCs w:val="20"/>
-          <w:lang w:val="en-US"/>
-        </w:rPr>
-      </w:pPr>
-      <w:r>
-        <w:rPr>
-          <w:rFonts w:ascii="Helvetica" w:hAnsi="Helvetica"/>
-          <w:i/>
-          <w:iCs/>
-          <w:sz w:val="20"/>
-          <w:szCs w:val="20"/>
-        </w:rPr>
-        <w:t xml:space="preserve">+  </w:t>
-      </w:r>
-      <w:r>
-        <w:rPr>
-          <w:rFonts w:ascii="Helvetica" w:hAnsi="Helvetica"/>
-          <w:i/>
-          <w:iCs/>
-          <w:sz w:val="20"/>
-          <w:szCs w:val="20"/>
-          <w:lang w:val="en-US"/>
-        </w:rPr>
-        <w:t xml:space="preserve">Pedagogical Training Module </w:t>
-      </w:r>
-      <w:r>
-        <w:rPr>
-          <w:rFonts w:ascii="Helvetica" w:hAnsi="Helvetica"/>
-          <w:i/>
-          <w:iCs/>
-          <w:sz w:val="20"/>
-          <w:szCs w:val="20"/>
-          <w:lang w:val="en-US"/>
-        </w:rPr>
-        <w:t>(</w:t>
+          <w:lang w:val="en-US"/>
+        </w:rPr>
+        <w:t>Pedagogical Training Module (</w:t>
       </w:r>
       <w:r>
         <w:rPr>
@@ -1260,7 +2478,177 @@
           <w:sz w:val="20"/>
           <w:szCs w:val="20"/>
         </w:rPr>
-        <w:t>NOVA School of Science and Technology</w:t>
+        <w:t xml:space="preserve">NOVA </w:t>
+      </w:r>
+      <w:proofErr w:type="spellStart"/>
+      <w:r>
+        <w:rPr>
+          <w:rFonts w:ascii="Helvetica" w:hAnsi="Helvetica"/>
+          <w:b/>
+          <w:bCs/>
+          <w:i/>
+          <w:iCs/>
+          <w:sz w:val="20"/>
+          <w:szCs w:val="20"/>
+        </w:rPr>
+        <w:t>School</w:t>
+      </w:r>
+      <w:proofErr w:type="spellEnd"/>
+      <w:r>
+        <w:rPr>
+          <w:rFonts w:ascii="Helvetica" w:hAnsi="Helvetica"/>
+          <w:b/>
+          <w:bCs/>
+          <w:i/>
+          <w:iCs/>
+          <w:sz w:val="20"/>
+          <w:szCs w:val="20"/>
+        </w:rPr>
+        <w:t xml:space="preserve"> of </w:t>
+      </w:r>
+      <w:proofErr w:type="spellStart"/>
+      <w:r>
+        <w:rPr>
+          <w:rFonts w:ascii="Helvetica" w:hAnsi="Helvetica"/>
+          <w:b/>
+          <w:bCs/>
+          <w:i/>
+          <w:iCs/>
+          <w:sz w:val="20"/>
+          <w:szCs w:val="20"/>
+        </w:rPr>
+        <w:t>Science</w:t>
+      </w:r>
+      <w:proofErr w:type="spellEnd"/>
+      <w:r>
+        <w:rPr>
+          <w:rFonts w:ascii="Helvetica" w:hAnsi="Helvetica"/>
+          <w:b/>
+          <w:bCs/>
+          <w:i/>
+          <w:iCs/>
+          <w:sz w:val="20"/>
+          <w:szCs w:val="20"/>
+        </w:rPr>
+        <w:t xml:space="preserve"> </w:t>
+      </w:r>
+      <w:proofErr w:type="spellStart"/>
+      <w:r>
+        <w:rPr>
+          <w:rFonts w:ascii="Helvetica" w:hAnsi="Helvetica"/>
+          <w:b/>
+          <w:bCs/>
+          <w:i/>
+          <w:iCs/>
+          <w:sz w:val="20"/>
+          <w:szCs w:val="20"/>
+        </w:rPr>
+        <w:t>and</w:t>
+      </w:r>
+      <w:proofErr w:type="spellEnd"/>
+      <w:r>
+        <w:rPr>
+          <w:rFonts w:ascii="Helvetica" w:hAnsi="Helvetica"/>
+          <w:b/>
+          <w:bCs/>
+          <w:i/>
+          <w:iCs/>
+          <w:sz w:val="20"/>
+          <w:szCs w:val="20"/>
+        </w:rPr>
+        <w:t xml:space="preserve"> Technology</w:t>
+      </w:r>
+      <w:r>
+        <w:rPr>
+          <w:rFonts w:ascii="Helvetica" w:hAnsi="Helvetica"/>
+          <w:b/>
+          <w:bCs/>
+          <w:i/>
+          <w:iCs/>
+          <w:sz w:val="20"/>
+          <w:szCs w:val="20"/>
+        </w:rPr>
+        <w:t xml:space="preserve"> </w:t>
+      </w:r>
+      <w:r>
+        <w:rPr>
+          <w:rFonts w:ascii="Helvetica" w:hAnsi="Helvetica"/>
+          <w:sz w:val="20"/>
+          <w:szCs w:val="20"/>
+        </w:rPr>
+        <w:t>|</w:t>
+      </w:r>
+      <w:r>
+        <w:rPr>
+          <w:rFonts w:ascii="Helvetica" w:hAnsi="Helvetica"/>
+          <w:sz w:val="20"/>
+          <w:szCs w:val="20"/>
+        </w:rPr>
+        <w:t xml:space="preserve"> </w:t>
+      </w:r>
+      <w:proofErr w:type="spellStart"/>
+      <w:r>
+        <w:rPr>
+          <w:rFonts w:ascii="Helvetica" w:hAnsi="Helvetica"/>
+          <w:i/>
+          <w:iCs/>
+          <w:sz w:val="20"/>
+          <w:szCs w:val="20"/>
+        </w:rPr>
+        <w:t>September</w:t>
+      </w:r>
+      <w:proofErr w:type="spellEnd"/>
+      <w:r>
+        <w:rPr>
+          <w:rFonts w:ascii="Helvetica" w:hAnsi="Helvetica"/>
+          <w:i/>
+          <w:iCs/>
+          <w:sz w:val="20"/>
+          <w:szCs w:val="20"/>
+        </w:rPr>
+        <w:t xml:space="preserve"> 2025 </w:t>
+      </w:r>
+      <w:r>
+        <w:rPr>
+          <w:rFonts w:ascii="Helvetica" w:hAnsi="Helvetica"/>
+          <w:i/>
+          <w:iCs/>
+          <w:sz w:val="20"/>
+          <w:szCs w:val="20"/>
+        </w:rPr>
+        <w:t>-</w:t>
+      </w:r>
+      <w:r>
+        <w:rPr>
+          <w:rFonts w:ascii="Helvetica" w:hAnsi="Helvetica"/>
+          <w:i/>
+          <w:iCs/>
+          <w:sz w:val="20"/>
+          <w:szCs w:val="20"/>
+        </w:rPr>
+        <w:t xml:space="preserve"> </w:t>
+      </w:r>
+      <w:proofErr w:type="spellStart"/>
+      <w:r>
+        <w:rPr>
+          <w:rFonts w:ascii="Helvetica" w:hAnsi="Helvetica"/>
+          <w:i/>
+          <w:iCs/>
+          <w:sz w:val="20"/>
+          <w:szCs w:val="20"/>
+        </w:rPr>
+        <w:t>January</w:t>
+      </w:r>
+      <w:proofErr w:type="spellEnd"/>
+      <w:r>
+        <w:rPr>
+          <w:rFonts w:ascii="Helvetica" w:hAnsi="Helvetica"/>
+          <w:i/>
+          <w:iCs/>
+          <w:sz w:val="20"/>
+          <w:szCs w:val="20"/>
+        </w:rPr>
+        <w:t xml:space="preserve"> 2026</w:t>
       </w:r>
     </w:p>
     <w:p>
@@ -1272,7 +2660,6 @@
           <w:bCs/>
           <w:sz w:val="20"/>
           <w:szCs w:val="20"/>
-          <w:lang w:val="en-US"/>
         </w:rPr>
       </w:pPr>
       <w:r>
@@ -1282,23 +2669,46 @@
           <w:bCs/>
           <w:sz w:val="20"/>
           <w:szCs w:val="20"/>
-          <w:lang w:val="en-US"/>
-        </w:rPr>
-        <w:t>Colegiul Național „Mihai Viteazul”, București</w:t>
-      </w:r>
+        </w:rPr>
+        <w:t>Mihai Viteazul National College</w:t>
+      </w:r>
+      <w:r>
+        <w:rPr>
+          <w:rFonts w:ascii="Helvetica" w:hAnsi="Helvetica"/>
+          <w:b/>
+          <w:bCs/>
+          <w:sz w:val="20"/>
+          <w:szCs w:val="20"/>
+        </w:rPr>
+        <w:t xml:space="preserve">, </w:t>
+      </w:r>
+      <w:proofErr w:type="spellStart"/>
+      <w:r>
+        <w:rPr>
+          <w:rFonts w:ascii="Helvetica" w:hAnsi="Helvetica"/>
+          <w:b/>
+          <w:bCs/>
+          <w:sz w:val="20"/>
+          <w:szCs w:val="20"/>
+        </w:rPr>
+        <w:t>Bucharest</w:t>
+      </w:r>
+      <w:proofErr w:type="spellEnd"/>
     </w:p>
     <w:p>
       <w:pPr>
+        <w:pStyle w:val="Listparagraf"/>
         <w:numPr>
           <w:ilvl w:val="0"/>
-          <w:numId w:val="13"/>
+          <w:numId w:val="17"/>
         </w:numPr>
         <w:spacing w:after="0"/>
         <w:rPr>
           <w:rFonts w:ascii="Helvetica" w:hAnsi="Helvetica"/>
-          <w:sz w:val="20"/>
-          <w:szCs w:val="20"/>
-          <w:lang w:val="en-US"/>
+          <w:b/>
+          <w:bCs/>
+          <w:sz w:val="20"/>
+          <w:szCs w:val="20"/>
         </w:rPr>
       </w:pPr>
       <w:r>
@@ -1328,17 +2738,6 @@
         </w:rPr>
         <w:t xml:space="preserve"> (9.95), Romanian (9.65).</w:t>
       </w:r>
-    </w:p>
-    <w:p>
-      <w:pPr>
-        <w:spacing w:after="0"/>
-        <w:rPr>
-          <w:rFonts w:ascii="Helvetica" w:hAnsi="Helvetica"/>
-          <w:sz w:val="20"/>
-          <w:szCs w:val="20"/>
-          <w:lang w:val="en-US"/>
-        </w:rPr>
-      </w:pPr>
     </w:p>
     <w:sectPr>
       <w:pgSz w:w="12240" w:h="15840"/>
@@ -2247,6 +3646,155 @@
     </w:lvl>
   </w:abstractNum>
   <w:abstractNum w:abstractNumId="6" w15:restartNumberingAfterBreak="0">
+    <w:nsid w:val="2CBD0324"/>
+    <w:multiLevelType w:val="multilevel"/>
+    <w:tmpl w:val="70EA27BC"/>
+    <w:lvl w:ilvl="0">
+      <w:start w:val="1"/>
+      <w:numFmt w:val="bullet"/>
+      <w:lvlText w:val=""/>
+      <w:lvlJc w:val="left"/>
+      <w:pPr>
+        <w:tabs>
+          <w:tab w:val="num" w:pos="720"/>
+        </w:tabs>
+        <w:ind w:left="720" w:hanging="360"/>
+      </w:pPr>
+      <w:rPr>
+        <w:rFonts w:ascii="Symbol" w:hAnsi="Symbol" w:hint="default"/>
+        <w:sz w:val="20"/>
+      </w:rPr>
+    </w:lvl>
+    <w:lvl w:ilvl="1" w:tentative="1">
+      <w:start w:val="1"/>
+      <w:numFmt w:val="bullet"/>
+      <w:lvlText w:val="o"/>
+      <w:lvlJc w:val="left"/>
+      <w:pPr>
+        <w:tabs>
+          <w:tab w:val="num" w:pos="1440"/>
+        </w:tabs>
+        <w:ind w:left="1440" w:hanging="360"/>
+      </w:pPr>
+      <w:rPr>
+        <w:rFonts w:ascii="Courier New" w:hAnsi="Courier New" w:hint="default"/>
+        <w:sz w:val="20"/>
+      </w:rPr>
+    </w:lvl>
+    <w:lvl w:ilvl="2" w:tentative="1">
+      <w:start w:val="1"/>
+      <w:numFmt w:val="bullet"/>
+      <w:lvlText w:val=""/>
+      <w:lvlJc w:val="left"/>
+      <w:pPr>
+        <w:tabs>
+          <w:tab w:val="num" w:pos="2160"/>
+        </w:tabs>
+        <w:ind w:left="2160" w:hanging="360"/>
+      </w:pPr>
+      <w:rPr>
+        <w:rFonts w:ascii="Wingdings" w:hAnsi="Wingdings" w:hint="default"/>
+        <w:sz w:val="20"/>
+      </w:rPr>
+    </w:lvl>
+    <w:lvl w:ilvl="3" w:tentative="1">
+      <w:start w:val="1"/>
+      <w:numFmt w:val="bullet"/>
+      <w:lvlText w:val=""/>
+      <w:lvlJc w:val="left"/>
+      <w:pPr>
+        <w:tabs>
+          <w:tab w:val="num" w:pos="2880"/>
+        </w:tabs>
+        <w:ind w:left="2880" w:hanging="360"/>
+      </w:pPr>
+      <w:rPr>
+        <w:rFonts w:ascii="Wingdings" w:hAnsi="Wingdings" w:hint="default"/>
+        <w:sz w:val="20"/>
+      </w:rPr>
+    </w:lvl>
+    <w:lvl w:ilvl="4" w:tentative="1">
+      <w:start w:val="1"/>
+      <w:numFmt w:val="bullet"/>
+      <w:lvlText w:val=""/>
+      <w:lvlJc w:val="left"/>
+      <w:pPr>
+        <w:tabs>
+          <w:tab w:val="num" w:pos="3600"/>
+        </w:tabs>
+        <w:ind w:left="3600" w:hanging="360"/>
+      </w:pPr>
+      <w:rPr>
+        <w:rFonts w:ascii="Wingdings" w:hAnsi="Wingdings" w:hint="default"/>
+        <w:sz w:val="20"/>
+      </w:rPr>
+    </w:lvl>
+    <w:lvl w:ilvl="5" w:tentative="1">
+      <w:start w:val="1"/>
+      <w:numFmt w:val="bullet"/>
+      <w:lvlText w:val=""/>
+      <w:lvlJc w:val="left"/>
+      <w:pPr>
+        <w:tabs>
+          <w:tab w:val="num" w:pos="4320"/>
+        </w:tabs>
+        <w:ind w:left="4320" w:hanging="360"/>
+      </w:pPr>
+      <w:rPr>
+        <w:rFonts w:ascii="Wingdings" w:hAnsi="Wingdings" w:hint="default"/>
+        <w:sz w:val="20"/>
+      </w:rPr>
+    </w:lvl>
+    <w:lvl w:ilvl="6" w:tentative="1">
+      <w:start w:val="1"/>
+      <w:numFmt w:val="bullet"/>
+      <w:lvlText w:val=""/>
+      <w:lvlJc w:val="left"/>
+      <w:pPr>
+        <w:tabs>
+          <w:tab w:val="num" w:pos="5040"/>
+        </w:tabs>
+        <w:ind w:left="5040" w:hanging="360"/>
+      </w:pPr>
+      <w:rPr>
+        <w:rFonts w:ascii="Wingdings" w:hAnsi="Wingdings" w:hint="default"/>
+        <w:sz w:val="20"/>
+      </w:rPr>
+    </w:lvl>
+    <w:lvl w:ilvl="7" w:tentative="1">
+      <w:start w:val="1"/>
+      <w:numFmt w:val="bullet"/>
+      <w:lvlText w:val=""/>
+      <w:lvlJc w:val="left"/>
+      <w:pPr>
+        <w:tabs>
+          <w:tab w:val="num" w:pos="5760"/>
+        </w:tabs>
+        <w:ind w:left="5760" w:hanging="360"/>
+      </w:pPr>
+      <w:rPr>
+        <w:rFonts w:ascii="Wingdings" w:hAnsi="Wingdings" w:hint="default"/>
+        <w:sz w:val="20"/>
+      </w:rPr>
+    </w:lvl>
+    <w:lvl w:ilvl="8" w:tentative="1">
+      <w:start w:val="1"/>
+      <w:numFmt w:val="bullet"/>
+      <w:lvlText w:val=""/>
+      <w:lvlJc w:val="left"/>
+      <w:pPr>
+        <w:tabs>
+          <w:tab w:val="num" w:pos="6480"/>
+        </w:tabs>
+        <w:ind w:left="6480" w:hanging="360"/>
+      </w:pPr>
+      <w:rPr>
+        <w:rFonts w:ascii="Wingdings" w:hAnsi="Wingdings" w:hint="default"/>
+        <w:sz w:val="20"/>
+      </w:rPr>
+    </w:lvl>
+  </w:abstractNum>
+  <w:abstractNum w:abstractNumId="7" w15:restartNumberingAfterBreak="0">
     <w:nsid w:val="39D00F9C"/>
     <w:multiLevelType w:val="multilevel"/>
     <w:tmpl w:val="EE44457A"/>
@@ -2395,7 +3943,7 @@
       </w:rPr>
     </w:lvl>
   </w:abstractNum>
-  <w:abstractNum w:abstractNumId="7" w15:restartNumberingAfterBreak="0">
+  <w:abstractNum w:abstractNumId="8" w15:restartNumberingAfterBreak="0">
     <w:nsid w:val="3B8A5201"/>
     <w:multiLevelType w:val="multilevel"/>
     <w:tmpl w:val="2AE637E0"/>
@@ -2544,7 +4092,7 @@
       </w:rPr>
     </w:lvl>
   </w:abstractNum>
-  <w:abstractNum w:abstractNumId="8" w15:restartNumberingAfterBreak="0">
+  <w:abstractNum w:abstractNumId="9" w15:restartNumberingAfterBreak="0">
     <w:nsid w:val="3F682A3B"/>
     <w:multiLevelType w:val="multilevel"/>
     <w:tmpl w:val="AF6AFBD8"/>
@@ -2693,7 +4241,7 @@
       </w:rPr>
     </w:lvl>
   </w:abstractNum>
-  <w:abstractNum w:abstractNumId="9" w15:restartNumberingAfterBreak="0">
+  <w:abstractNum w:abstractNumId="10" w15:restartNumberingAfterBreak="0">
     <w:nsid w:val="4C3666EB"/>
     <w:multiLevelType w:val="multilevel"/>
     <w:tmpl w:val="1D60691E"/>
@@ -2842,7 +4390,7 @@
       </w:rPr>
     </w:lvl>
   </w:abstractNum>
-  <w:abstractNum w:abstractNumId="10" w15:restartNumberingAfterBreak="0">
+  <w:abstractNum w:abstractNumId="11" w15:restartNumberingAfterBreak="0">
     <w:nsid w:val="4C603B81"/>
     <w:multiLevelType w:val="multilevel"/>
     <w:tmpl w:val="228CA33A"/>
@@ -2991,7 +4539,7 @@
       </w:rPr>
     </w:lvl>
   </w:abstractNum>
-  <w:abstractNum w:abstractNumId="11" w15:restartNumberingAfterBreak="0">
+  <w:abstractNum w:abstractNumId="12" w15:restartNumberingAfterBreak="0">
     <w:nsid w:val="519B6166"/>
     <w:multiLevelType w:val="multilevel"/>
     <w:tmpl w:val="AF143426"/>
@@ -3140,7 +4688,233 @@
       </w:rPr>
     </w:lvl>
   </w:abstractNum>
-  <w:abstractNum w:abstractNumId="12" w15:restartNumberingAfterBreak="0">
+  <w:abstractNum w:abstractNumId="13" w15:restartNumberingAfterBreak="0">
+    <w:nsid w:val="5D4033FD"/>
+    <w:multiLevelType w:val="hybridMultilevel"/>
+    <w:tmpl w:val="C8C81D0E"/>
+    <w:lvl w:ilvl="0" w:tplc="04090001">
+      <w:start w:val="1"/>
+      <w:numFmt w:val="bullet"/>
+      <w:lvlText w:val=""/>
+      <w:lvlJc w:val="left"/>
+      <w:pPr>
+        <w:ind w:left="720" w:hanging="360"/>
+      </w:pPr>
+      <w:rPr>
+        <w:rFonts w:ascii="Symbol" w:hAnsi="Symbol" w:hint="default"/>
+      </w:rPr>
+    </w:lvl>
+    <w:lvl w:ilvl="1" w:tplc="04090003" w:tentative="1">
+      <w:start w:val="1"/>
+      <w:numFmt w:val="bullet"/>
+      <w:lvlText w:val="o"/>
+      <w:lvlJc w:val="left"/>
+      <w:pPr>
+        <w:ind w:left="1440" w:hanging="360"/>
+      </w:pPr>
+      <w:rPr>
+        <w:rFonts w:ascii="Courier New" w:hAnsi="Courier New" w:cs="Courier New" w:hint="default"/>
+      </w:rPr>
+    </w:lvl>
+    <w:lvl w:ilvl="2" w:tplc="04090005" w:tentative="1">
+      <w:start w:val="1"/>
+      <w:numFmt w:val="bullet"/>
+      <w:lvlText w:val=""/>
+      <w:lvlJc w:val="left"/>
+      <w:pPr>
+        <w:ind w:left="2160" w:hanging="360"/>
+      </w:pPr>
+      <w:rPr>
+        <w:rFonts w:ascii="Wingdings" w:hAnsi="Wingdings" w:hint="default"/>
+      </w:rPr>
+    </w:lvl>
+    <w:lvl w:ilvl="3" w:tplc="04090001" w:tentative="1">
+      <w:start w:val="1"/>
+      <w:numFmt w:val="bullet"/>
+      <w:lvlText w:val=""/>
+      <w:lvlJc w:val="left"/>
+      <w:pPr>
+        <w:ind w:left="2880" w:hanging="360"/>
+      </w:pPr>
+      <w:rPr>
+        <w:rFonts w:ascii="Symbol" w:hAnsi="Symbol" w:hint="default"/>
+      </w:rPr>
+    </w:lvl>
+    <w:lvl w:ilvl="4" w:tplc="04090003" w:tentative="1">
+      <w:start w:val="1"/>
+      <w:numFmt w:val="bullet"/>
+      <w:lvlText w:val="o"/>
+      <w:lvlJc w:val="left"/>
+      <w:pPr>
+        <w:ind w:left="3600" w:hanging="360"/>
+      </w:pPr>
+      <w:rPr>
+        <w:rFonts w:ascii="Courier New" w:hAnsi="Courier New" w:cs="Courier New" w:hint="default"/>
+      </w:rPr>
+    </w:lvl>
+    <w:lvl w:ilvl="5" w:tplc="04090005" w:tentative="1">
+      <w:start w:val="1"/>
+      <w:numFmt w:val="bullet"/>
+      <w:lvlText w:val=""/>
+      <w:lvlJc w:val="left"/>
+      <w:pPr>
+        <w:ind w:left="4320" w:hanging="360"/>
+      </w:pPr>
+      <w:rPr>
+        <w:rFonts w:ascii="Wingdings" w:hAnsi="Wingdings" w:hint="default"/>
+      </w:rPr>
+    </w:lvl>
+    <w:lvl w:ilvl="6" w:tplc="04090001" w:tentative="1">
+      <w:start w:val="1"/>
+      <w:numFmt w:val="bullet"/>
+      <w:lvlText w:val=""/>
+      <w:lvlJc w:val="left"/>
+      <w:pPr>
+        <w:ind w:left="5040" w:hanging="360"/>
+      </w:pPr>
+      <w:rPr>
+        <w:rFonts w:ascii="Symbol" w:hAnsi="Symbol" w:hint="default"/>
+      </w:rPr>
+    </w:lvl>
+    <w:lvl w:ilvl="7" w:tplc="04090003" w:tentative="1">
+      <w:start w:val="1"/>
+      <w:numFmt w:val="bullet"/>
+      <w:lvlText w:val="o"/>
+      <w:lvlJc w:val="left"/>
+      <w:pPr>
+        <w:ind w:left="5760" w:hanging="360"/>
+      </w:pPr>
+      <w:rPr>
+        <w:rFonts w:ascii="Courier New" w:hAnsi="Courier New" w:cs="Courier New" w:hint="default"/>
+      </w:rPr>
+    </w:lvl>
+    <w:lvl w:ilvl="8" w:tplc="04090005" w:tentative="1">
+      <w:start w:val="1"/>
+      <w:numFmt w:val="bullet"/>
+      <w:lvlText w:val=""/>
+      <w:lvlJc w:val="left"/>
+      <w:pPr>
+        <w:ind w:left="6480" w:hanging="360"/>
+      </w:pPr>
+      <w:rPr>
+        <w:rFonts w:ascii="Wingdings" w:hAnsi="Wingdings" w:hint="default"/>
+      </w:rPr>
+    </w:lvl>
+  </w:abstractNum>
+  <w:abstractNum w:abstractNumId="14" w15:restartNumberingAfterBreak="0">
+    <w:nsid w:val="6A173CF7"/>
+    <w:multiLevelType w:val="hybridMultilevel"/>
+    <w:tmpl w:val="3190AB58"/>
+    <w:lvl w:ilvl="0" w:tplc="04090001">
+      <w:start w:val="1"/>
+      <w:numFmt w:val="bullet"/>
+      <w:lvlText w:val=""/>
+      <w:lvlJc w:val="left"/>
+      <w:pPr>
+        <w:ind w:left="720" w:hanging="360"/>
+      </w:pPr>
+      <w:rPr>
+        <w:rFonts w:ascii="Symbol" w:hAnsi="Symbol" w:hint="default"/>
+      </w:rPr>
+    </w:lvl>
+    <w:lvl w:ilvl="1" w:tplc="04090003" w:tentative="1">
+      <w:start w:val="1"/>
+      <w:numFmt w:val="bullet"/>
+      <w:lvlText w:val="o"/>
+      <w:lvlJc w:val="left"/>
+      <w:pPr>
+        <w:ind w:left="1440" w:hanging="360"/>
+      </w:pPr>
+      <w:rPr>
+        <w:rFonts w:ascii="Courier New" w:hAnsi="Courier New" w:cs="Courier New" w:hint="default"/>
+      </w:rPr>
+    </w:lvl>
+    <w:lvl w:ilvl="2" w:tplc="04090005" w:tentative="1">
+      <w:start w:val="1"/>
+      <w:numFmt w:val="bullet"/>
+      <w:lvlText w:val=""/>
+      <w:lvlJc w:val="left"/>
+      <w:pPr>
+        <w:ind w:left="2160" w:hanging="360"/>
+      </w:pPr>
+      <w:rPr>
+        <w:rFonts w:ascii="Wingdings" w:hAnsi="Wingdings" w:hint="default"/>
+      </w:rPr>
+    </w:lvl>
+    <w:lvl w:ilvl="3" w:tplc="04090001" w:tentative="1">
+      <w:start w:val="1"/>
+      <w:numFmt w:val="bullet"/>
+      <w:lvlText w:val=""/>
+      <w:lvlJc w:val="left"/>
+      <w:pPr>
+        <w:ind w:left="2880" w:hanging="360"/>
+      </w:pPr>
+      <w:rPr>
+        <w:rFonts w:ascii="Symbol" w:hAnsi="Symbol" w:hint="default"/>
+      </w:rPr>
+    </w:lvl>
+    <w:lvl w:ilvl="4" w:tplc="04090003" w:tentative="1">
+      <w:start w:val="1"/>
+      <w:numFmt w:val="bullet"/>
+      <w:lvlText w:val="o"/>
+      <w:lvlJc w:val="left"/>
+      <w:pPr>
+        <w:ind w:left="3600" w:hanging="360"/>
+      </w:pPr>
+      <w:rPr>
+        <w:rFonts w:ascii="Courier New" w:hAnsi="Courier New" w:cs="Courier New" w:hint="default"/>
+      </w:rPr>
+    </w:lvl>
+    <w:lvl w:ilvl="5" w:tplc="04090005" w:tentative="1">
+      <w:start w:val="1"/>
+      <w:numFmt w:val="bullet"/>
+      <w:lvlText w:val=""/>
+      <w:lvlJc w:val="left"/>
+      <w:pPr>
+        <w:ind w:left="4320" w:hanging="360"/>
+      </w:pPr>
+      <w:rPr>
+        <w:rFonts w:ascii="Wingdings" w:hAnsi="Wingdings" w:hint="default"/>
+      </w:rPr>
+    </w:lvl>
+    <w:lvl w:ilvl="6" w:tplc="04090001" w:tentative="1">
+      <w:start w:val="1"/>
+      <w:numFmt w:val="bullet"/>
+      <w:lvlText w:val=""/>
+      <w:lvlJc w:val="left"/>
+      <w:pPr>
+        <w:ind w:left="5040" w:hanging="360"/>
+      </w:pPr>
+      <w:rPr>
+        <w:rFonts w:ascii="Symbol" w:hAnsi="Symbol" w:hint="default"/>
+      </w:rPr>
+    </w:lvl>
+    <w:lvl w:ilvl="7" w:tplc="04090003" w:tentative="1">
+      <w:start w:val="1"/>
+      <w:numFmt w:val="bullet"/>
+      <w:lvlText w:val="o"/>
+      <w:lvlJc w:val="left"/>
+      <w:pPr>
+        <w:ind w:left="5760" w:hanging="360"/>
+      </w:pPr>
+      <w:rPr>
+        <w:rFonts w:ascii="Courier New" w:hAnsi="Courier New" w:cs="Courier New" w:hint="default"/>
+      </w:rPr>
+    </w:lvl>
+    <w:lvl w:ilvl="8" w:tplc="04090005" w:tentative="1">
+      <w:start w:val="1"/>
+      <w:numFmt w:val="bullet"/>
+      <w:lvlText w:val=""/>
+      <w:lvlJc w:val="left"/>
+      <w:pPr>
+        <w:ind w:left="6480" w:hanging="360"/>
+      </w:pPr>
+      <w:rPr>
+        <w:rFonts w:ascii="Wingdings" w:hAnsi="Wingdings" w:hint="default"/>
+      </w:rPr>
+    </w:lvl>
+  </w:abstractNum>
+  <w:abstractNum w:abstractNumId="15" w15:restartNumberingAfterBreak="0">
     <w:nsid w:val="6C751FA4"/>
     <w:multiLevelType w:val="multilevel"/>
     <w:tmpl w:val="3340A1C4"/>
@@ -3289,7 +5063,7 @@
       </w:rPr>
     </w:lvl>
   </w:abstractNum>
-  <w:abstractNum w:abstractNumId="13" w15:restartNumberingAfterBreak="0">
+  <w:abstractNum w:abstractNumId="16" w15:restartNumberingAfterBreak="0">
     <w:nsid w:val="7D200F73"/>
     <w:multiLevelType w:val="multilevel"/>
     <w:tmpl w:val="D826C746"/>
@@ -3439,22 +5213,22 @@
     </w:lvl>
   </w:abstractNum>
   <w:num w:numId="1" w16cid:durableId="1259213701">
-    <w:abstractNumId w:val="7"/>
+    <w:abstractNumId w:val="8"/>
   </w:num>
   <w:num w:numId="2" w16cid:durableId="944311050">
-    <w:abstractNumId w:val="13"/>
+    <w:abstractNumId w:val="16"/>
   </w:num>
   <w:num w:numId="3" w16cid:durableId="463620696">
-    <w:abstractNumId w:val="8"/>
+    <w:abstractNumId w:val="9"/>
   </w:num>
   <w:num w:numId="4" w16cid:durableId="250626716">
+    <w:abstractNumId w:val="12"/>
+  </w:num>
+  <w:num w:numId="5" w16cid:durableId="1080250569">
     <w:abstractNumId w:val="11"/>
   </w:num>
-  <w:num w:numId="5" w16cid:durableId="1080250569">
-    <w:abstractNumId w:val="10"/>
-  </w:num>
   <w:num w:numId="6" w16cid:durableId="1057897119">
-    <w:abstractNumId w:val="12"/>
+    <w:abstractNumId w:val="15"/>
   </w:num>
   <w:num w:numId="7" w16cid:durableId="2051614843">
     <w:abstractNumId w:val="3"/>
@@ -3472,13 +5246,22 @@
     <w:abstractNumId w:val="2"/>
   </w:num>
   <w:num w:numId="12" w16cid:durableId="211501260">
-    <w:abstractNumId w:val="9"/>
+    <w:abstractNumId w:val="10"/>
   </w:num>
   <w:num w:numId="13" w16cid:durableId="49768576">
     <w:abstractNumId w:val="1"/>
   </w:num>
   <w:num w:numId="14" w16cid:durableId="1405956486">
+    <w:abstractNumId w:val="7"/>
+  </w:num>
+  <w:num w:numId="15" w16cid:durableId="1637835105">
     <w:abstractNumId w:val="6"/>
+  </w:num>
+  <w:num w:numId="16" w16cid:durableId="242686623">
+    <w:abstractNumId w:val="14"/>
+  </w:num>
+  <w:num w:numId="17" w16cid:durableId="1900700610">
+    <w:abstractNumId w:val="13"/>
   </w:num>
 </w:numbering>
 </file>

</xml_diff>